<commit_message>
Knowledge - 3-Work knowledge - fix location - part 18 - 11/8/2025
</commit_message>
<xml_diff>
--- a/Knowledge/3-Work knowledge/1-Software Engineering/1-Testing/5-My Source/1-ISTQB Foundation Level/3-Static Testing/1-Review/2-Review Process Activities.docx
+++ b/Knowledge/3-Work knowledge/1-Software Engineering/1-Testing/5-My Source/1-ISTQB Foundation Level/3-Static Testing/1-Review/2-Review Process Activities.docx
@@ -32,21 +32,12 @@
         </w:rPr>
         <w:t xml:space="preserve">: </w:t>
       </w:r>
-      <w:proofErr w:type="spellStart"/>
-      <w:r>
-        <w:rPr>
-          <w:b/>
-          <w:shd w:val="clear" w:color="auto" w:fill="B7B7B7"/>
-        </w:rPr>
-        <w:t>Chatgpt</w:t>
-      </w:r>
-      <w:proofErr w:type="spellEnd"/>
-      <w:r>
-        <w:rPr>
-          <w:b/>
-          <w:shd w:val="clear" w:color="auto" w:fill="B7B7B7"/>
-        </w:rPr>
-        <w:t xml:space="preserve"> </w:t>
+      <w:r>
+        <w:rPr>
+          <w:b/>
+          <w:shd w:val="clear" w:color="auto" w:fill="B7B7B7"/>
+        </w:rPr>
+        <w:t xml:space="preserve">Chatgpt </w:t>
       </w:r>
       <w:r>
         <w:rPr>
@@ -55,7 +46,26 @@
           <w:szCs w:val="14"/>
           <w:shd w:val="clear" w:color="auto" w:fill="B7B7B7"/>
         </w:rPr>
-        <w:t>(GPT-5-Standard) at [8/14/2025]</w:t>
+        <w:t>(GPT</w:t>
+      </w:r>
+      <w:r>
+        <w:rPr>
+          <w:rFonts w:ascii="Cambria Math" w:hAnsi="Cambria Math" w:cs="Cambria Math"/>
+          <w:b/>
+          <w:sz w:val="14"/>
+          <w:szCs w:val="14"/>
+          <w:shd w:val="clear" w:color="auto" w:fill="B7B7B7"/>
+        </w:rPr>
+        <w:t>‑</w:t>
+      </w:r>
+      <w:r>
+        <w:rPr>
+          <w:b/>
+          <w:sz w:val="14"/>
+          <w:szCs w:val="14"/>
+          <w:shd w:val="clear" w:color="auto" w:fill="B7B7B7"/>
+        </w:rPr>
+        <w:t>5 Mini) at [8/14/2025]</w:t>
       </w:r>
     </w:p>
     <w:p>
@@ -112,21 +122,12 @@
         </w:rPr>
         <w:t xml:space="preserve">: </w:t>
       </w:r>
-      <w:proofErr w:type="spellStart"/>
-      <w:r>
-        <w:rPr>
-          <w:b/>
-          <w:shd w:val="clear" w:color="auto" w:fill="B7B7B7"/>
-        </w:rPr>
-        <w:t>Chatgpt</w:t>
-      </w:r>
-      <w:proofErr w:type="spellEnd"/>
-      <w:r>
-        <w:rPr>
-          <w:b/>
-          <w:shd w:val="clear" w:color="auto" w:fill="B7B7B7"/>
-        </w:rPr>
-        <w:t xml:space="preserve"> </w:t>
+      <w:r>
+        <w:rPr>
+          <w:b/>
+          <w:shd w:val="clear" w:color="auto" w:fill="B7B7B7"/>
+        </w:rPr>
+        <w:t xml:space="preserve">Chatgpt </w:t>
       </w:r>
       <w:r>
         <w:rPr>
@@ -135,7 +136,26 @@
           <w:szCs w:val="14"/>
           <w:shd w:val="clear" w:color="auto" w:fill="B7B7B7"/>
         </w:rPr>
-        <w:t>(GPT-5-Standard) at [8/14/2025]</w:t>
+        <w:t>(GPT</w:t>
+      </w:r>
+      <w:r>
+        <w:rPr>
+          <w:rFonts w:ascii="Cambria Math" w:hAnsi="Cambria Math" w:cs="Cambria Math"/>
+          <w:b/>
+          <w:sz w:val="14"/>
+          <w:szCs w:val="14"/>
+          <w:shd w:val="clear" w:color="auto" w:fill="B7B7B7"/>
+        </w:rPr>
+        <w:t>‑</w:t>
+      </w:r>
+      <w:r>
+        <w:rPr>
+          <w:b/>
+          <w:sz w:val="14"/>
+          <w:szCs w:val="14"/>
+          <w:shd w:val="clear" w:color="auto" w:fill="B7B7B7"/>
+        </w:rPr>
+        <w:t>5 Mini) at [8/14/2025]</w:t>
       </w:r>
     </w:p>
     <w:p>
@@ -154,7 +174,7 @@
     </w:p>
     <w:p>
       <w:r>
-        <w:pict w14:anchorId="3B0AD740">
+        <w:pict w14:anchorId="2FC19F61">
           <v:rect id="_x0000_i1025" style="width:0;height:1.5pt" o:hralign="center" o:hrstd="t" o:hr="t" fillcolor="#a0a0a0" stroked="f"/>
         </w:pict>
       </w:r>
@@ -188,21 +208,12 @@
         </w:rPr>
         <w:t xml:space="preserve">: </w:t>
       </w:r>
-      <w:proofErr w:type="spellStart"/>
-      <w:r>
-        <w:rPr>
-          <w:b/>
-          <w:shd w:val="clear" w:color="auto" w:fill="B7B7B7"/>
-        </w:rPr>
-        <w:t>Chatgpt</w:t>
-      </w:r>
-      <w:proofErr w:type="spellEnd"/>
-      <w:r>
-        <w:rPr>
-          <w:b/>
-          <w:shd w:val="clear" w:color="auto" w:fill="B7B7B7"/>
-        </w:rPr>
-        <w:t xml:space="preserve"> </w:t>
+      <w:r>
+        <w:rPr>
+          <w:b/>
+          <w:shd w:val="clear" w:color="auto" w:fill="B7B7B7"/>
+        </w:rPr>
+        <w:t xml:space="preserve">Chatgpt </w:t>
       </w:r>
       <w:r>
         <w:rPr>
@@ -211,7 +222,26 @@
           <w:szCs w:val="14"/>
           <w:shd w:val="clear" w:color="auto" w:fill="B7B7B7"/>
         </w:rPr>
-        <w:t>(GPT-5-Standard) at [8/14/2025]</w:t>
+        <w:t>(GPT</w:t>
+      </w:r>
+      <w:r>
+        <w:rPr>
+          <w:rFonts w:ascii="Cambria Math" w:hAnsi="Cambria Math" w:cs="Cambria Math"/>
+          <w:b/>
+          <w:sz w:val="14"/>
+          <w:szCs w:val="14"/>
+          <w:shd w:val="clear" w:color="auto" w:fill="B7B7B7"/>
+        </w:rPr>
+        <w:t>‑</w:t>
+      </w:r>
+      <w:r>
+        <w:rPr>
+          <w:b/>
+          <w:sz w:val="14"/>
+          <w:szCs w:val="14"/>
+          <w:shd w:val="clear" w:color="auto" w:fill="B7B7B7"/>
+        </w:rPr>
+        <w:t>5 Mini) at [8/14/2025]</w:t>
       </w:r>
     </w:p>
     <w:p>
@@ -383,8 +413,7 @@
     </w:p>
     <w:p>
       <w:r>
-        <w:lastRenderedPageBreak/>
-        <w:pict w14:anchorId="3FC35304">
+        <w:pict w14:anchorId="320C2135">
           <v:rect id="_x0000_i1026" style="width:0;height:1.5pt" o:hralign="center" o:hrstd="t" o:hr="t" fillcolor="#a0a0a0" stroked="f"/>
         </w:pict>
       </w:r>
@@ -401,19 +430,14 @@
       <w:bookmarkStart w:id="3" w:name="_l4ykpjjvh53c" w:colFirst="0" w:colLast="0"/>
       <w:bookmarkEnd w:id="3"/>
       <w:r>
+        <w:lastRenderedPageBreak/>
         <w:t xml:space="preserve">2. </w:t>
       </w:r>
       <w:r>
         <w:rPr>
           <w:lang w:val="en-US"/>
         </w:rPr>
-        <w:t>Review initiation</w:t>
-      </w:r>
-      <w:r>
-        <w:rPr>
-          <w:lang w:val="en-US"/>
-        </w:rPr>
-        <w:t xml:space="preserve"> or</w:t>
+        <w:t>Review initiation or</w:t>
       </w:r>
       <w:r>
         <w:rPr>
@@ -450,21 +474,12 @@
         </w:rPr>
         <w:t xml:space="preserve">: </w:t>
       </w:r>
-      <w:proofErr w:type="spellStart"/>
-      <w:r>
-        <w:rPr>
-          <w:b/>
-          <w:shd w:val="clear" w:color="auto" w:fill="B7B7B7"/>
-        </w:rPr>
-        <w:t>Chatgpt</w:t>
-      </w:r>
-      <w:proofErr w:type="spellEnd"/>
-      <w:r>
-        <w:rPr>
-          <w:b/>
-          <w:shd w:val="clear" w:color="auto" w:fill="B7B7B7"/>
-        </w:rPr>
-        <w:t xml:space="preserve"> </w:t>
+      <w:r>
+        <w:rPr>
+          <w:b/>
+          <w:shd w:val="clear" w:color="auto" w:fill="B7B7B7"/>
+        </w:rPr>
+        <w:t xml:space="preserve">Chatgpt </w:t>
       </w:r>
       <w:r>
         <w:rPr>
@@ -473,7 +488,26 @@
           <w:szCs w:val="14"/>
           <w:shd w:val="clear" w:color="auto" w:fill="B7B7B7"/>
         </w:rPr>
-        <w:t>(GPT-5-Standard) at [8/14/2025]</w:t>
+        <w:t>(GPT</w:t>
+      </w:r>
+      <w:r>
+        <w:rPr>
+          <w:rFonts w:ascii="Cambria Math" w:hAnsi="Cambria Math" w:cs="Cambria Math"/>
+          <w:b/>
+          <w:sz w:val="14"/>
+          <w:szCs w:val="14"/>
+          <w:shd w:val="clear" w:color="auto" w:fill="B7B7B7"/>
+        </w:rPr>
+        <w:t>‑</w:t>
+      </w:r>
+      <w:r>
+        <w:rPr>
+          <w:b/>
+          <w:sz w:val="14"/>
+          <w:szCs w:val="14"/>
+          <w:shd w:val="clear" w:color="auto" w:fill="B7B7B7"/>
+        </w:rPr>
+        <w:t>5 Mini) at [8/14/2025]</w:t>
       </w:r>
     </w:p>
     <w:p>
@@ -628,7 +662,7 @@
     </w:p>
     <w:p>
       <w:r>
-        <w:pict w14:anchorId="51E60E46">
+        <w:pict w14:anchorId="1662C759">
           <v:rect id="_x0000_i1027" style="width:0;height:1.5pt" o:hralign="center" o:hrstd="t" o:hr="t" fillcolor="#a0a0a0" stroked="f"/>
         </w:pict>
       </w:r>
@@ -642,13 +676,7 @@
       <w:bookmarkStart w:id="4" w:name="_d7bvjxeotjye" w:colFirst="0" w:colLast="0"/>
       <w:bookmarkEnd w:id="4"/>
       <w:r>
-        <w:t>3. Individual Preparation</w:t>
-      </w:r>
-      <w:r>
-        <w:t xml:space="preserve"> (</w:t>
-      </w:r>
-      <w:r>
-        <w:t xml:space="preserve">or </w:t>
+        <w:t xml:space="preserve">3. Individual Preparation (or </w:t>
       </w:r>
       <w:r>
         <w:t>Individual Review</w:t>
@@ -674,21 +702,12 @@
         </w:rPr>
         <w:t xml:space="preserve">: </w:t>
       </w:r>
-      <w:proofErr w:type="spellStart"/>
-      <w:r>
-        <w:rPr>
-          <w:b/>
-          <w:shd w:val="clear" w:color="auto" w:fill="B7B7B7"/>
-        </w:rPr>
-        <w:t>Chatgpt</w:t>
-      </w:r>
-      <w:proofErr w:type="spellEnd"/>
-      <w:r>
-        <w:rPr>
-          <w:b/>
-          <w:shd w:val="clear" w:color="auto" w:fill="B7B7B7"/>
-        </w:rPr>
-        <w:t xml:space="preserve"> </w:t>
+      <w:r>
+        <w:rPr>
+          <w:b/>
+          <w:shd w:val="clear" w:color="auto" w:fill="B7B7B7"/>
+        </w:rPr>
+        <w:t xml:space="preserve">Chatgpt </w:t>
       </w:r>
       <w:r>
         <w:rPr>
@@ -697,7 +716,26 @@
           <w:szCs w:val="14"/>
           <w:shd w:val="clear" w:color="auto" w:fill="B7B7B7"/>
         </w:rPr>
-        <w:t>(GPT-5-Standard) at [8/14/2025]</w:t>
+        <w:t>(GPT</w:t>
+      </w:r>
+      <w:r>
+        <w:rPr>
+          <w:rFonts w:ascii="Cambria Math" w:hAnsi="Cambria Math" w:cs="Cambria Math"/>
+          <w:b/>
+          <w:sz w:val="14"/>
+          <w:szCs w:val="14"/>
+          <w:shd w:val="clear" w:color="auto" w:fill="B7B7B7"/>
+        </w:rPr>
+        <w:t>‑</w:t>
+      </w:r>
+      <w:r>
+        <w:rPr>
+          <w:b/>
+          <w:sz w:val="14"/>
+          <w:szCs w:val="14"/>
+          <w:shd w:val="clear" w:color="auto" w:fill="B7B7B7"/>
+        </w:rPr>
+        <w:t>5 Mini) at [8/14/2025]</w:t>
       </w:r>
     </w:p>
     <w:p>
@@ -835,25 +873,25 @@
           <w:rFonts w:ascii="Roboto Mono" w:eastAsia="Roboto Mono" w:hAnsi="Roboto Mono" w:cs="Roboto Mono"/>
           <w:b/>
         </w:rPr>
+        <w:t>Example:</w:t>
+      </w:r>
+      <w:r>
+        <w:rPr>
+          <w:rFonts w:ascii="Roboto Mono" w:eastAsia="Roboto Mono" w:hAnsi="Roboto Mono" w:cs="Roboto Mono"/>
+        </w:rPr>
+        <w:t xml:space="preserve"> Reviewer notes that "login" is sometimes called "sign in" in the SRS.</w:t>
+      </w:r>
+      <w:r>
+        <w:rPr>
+          <w:rFonts w:ascii="Roboto Mono" w:eastAsia="Roboto Mono" w:hAnsi="Roboto Mono" w:cs="Roboto Mono"/>
+        </w:rPr>
+        <w:br/>
+      </w:r>
+    </w:p>
+    <w:p>
+      <w:r>
         <w:lastRenderedPageBreak/>
-        <w:t>Example:</w:t>
-      </w:r>
-      <w:r>
-        <w:rPr>
-          <w:rFonts w:ascii="Roboto Mono" w:eastAsia="Roboto Mono" w:hAnsi="Roboto Mono" w:cs="Roboto Mono"/>
-        </w:rPr>
-        <w:t xml:space="preserve"> Reviewer notes that "login" is sometimes called "sign in" in the SRS.</w:t>
-      </w:r>
-      <w:r>
-        <w:rPr>
-          <w:rFonts w:ascii="Roboto Mono" w:eastAsia="Roboto Mono" w:hAnsi="Roboto Mono" w:cs="Roboto Mono"/>
-        </w:rPr>
-        <w:br/>
-      </w:r>
-    </w:p>
-    <w:p>
-      <w:r>
-        <w:pict w14:anchorId="54196DCF">
+        <w:pict w14:anchorId="668653AF">
           <v:rect id="_x0000_i1028" style="width:0;height:1.5pt" o:hralign="center" o:hrstd="t" o:hr="t" fillcolor="#a0a0a0" stroked="f"/>
         </w:pict>
       </w:r>
@@ -887,21 +925,12 @@
         </w:rPr>
         <w:t xml:space="preserve">: </w:t>
       </w:r>
-      <w:proofErr w:type="spellStart"/>
-      <w:r>
-        <w:rPr>
-          <w:b/>
-          <w:shd w:val="clear" w:color="auto" w:fill="B7B7B7"/>
-        </w:rPr>
-        <w:t>Chatgpt</w:t>
-      </w:r>
-      <w:proofErr w:type="spellEnd"/>
-      <w:r>
-        <w:rPr>
-          <w:b/>
-          <w:shd w:val="clear" w:color="auto" w:fill="B7B7B7"/>
-        </w:rPr>
-        <w:t xml:space="preserve"> </w:t>
+      <w:r>
+        <w:rPr>
+          <w:b/>
+          <w:shd w:val="clear" w:color="auto" w:fill="B7B7B7"/>
+        </w:rPr>
+        <w:t xml:space="preserve">Chatgpt </w:t>
       </w:r>
       <w:r>
         <w:rPr>
@@ -910,7 +939,26 @@
           <w:szCs w:val="14"/>
           <w:shd w:val="clear" w:color="auto" w:fill="B7B7B7"/>
         </w:rPr>
-        <w:t>(GPT-5-Standard) at [8/14/2025]</w:t>
+        <w:t>(GPT</w:t>
+      </w:r>
+      <w:r>
+        <w:rPr>
+          <w:rFonts w:ascii="Cambria Math" w:hAnsi="Cambria Math" w:cs="Cambria Math"/>
+          <w:b/>
+          <w:sz w:val="14"/>
+          <w:szCs w:val="14"/>
+          <w:shd w:val="clear" w:color="auto" w:fill="B7B7B7"/>
+        </w:rPr>
+        <w:t>‑</w:t>
+      </w:r>
+      <w:r>
+        <w:rPr>
+          <w:b/>
+          <w:sz w:val="14"/>
+          <w:szCs w:val="14"/>
+          <w:shd w:val="clear" w:color="auto" w:fill="B7B7B7"/>
+        </w:rPr>
+        <w:t>5 Mini) at [8/14/2025]</w:t>
       </w:r>
     </w:p>
     <w:p>
@@ -1065,7 +1113,7 @@
     </w:p>
     <w:p>
       <w:r>
-        <w:pict w14:anchorId="5E2CBD0E">
+        <w:pict w14:anchorId="4A453CD0">
           <v:rect id="_x0000_i1029" style="width:0;height:1.5pt" o:hralign="center" o:hrstd="t" o:hr="t" fillcolor="#a0a0a0" stroked="f"/>
         </w:pict>
       </w:r>
@@ -1099,21 +1147,12 @@
         </w:rPr>
         <w:t xml:space="preserve">: </w:t>
       </w:r>
-      <w:proofErr w:type="spellStart"/>
-      <w:r>
-        <w:rPr>
-          <w:b/>
-          <w:shd w:val="clear" w:color="auto" w:fill="B7B7B7"/>
-        </w:rPr>
-        <w:t>Chatgpt</w:t>
-      </w:r>
-      <w:proofErr w:type="spellEnd"/>
-      <w:r>
-        <w:rPr>
-          <w:b/>
-          <w:shd w:val="clear" w:color="auto" w:fill="B7B7B7"/>
-        </w:rPr>
-        <w:t xml:space="preserve"> </w:t>
+      <w:r>
+        <w:rPr>
+          <w:b/>
+          <w:shd w:val="clear" w:color="auto" w:fill="B7B7B7"/>
+        </w:rPr>
+        <w:t xml:space="preserve">Chatgpt </w:t>
       </w:r>
       <w:r>
         <w:rPr>
@@ -1122,7 +1161,26 @@
           <w:szCs w:val="14"/>
           <w:shd w:val="clear" w:color="auto" w:fill="B7B7B7"/>
         </w:rPr>
-        <w:t>(GPT-5-Standard) at [8/14/2025]</w:t>
+        <w:t>(GPT</w:t>
+      </w:r>
+      <w:r>
+        <w:rPr>
+          <w:rFonts w:ascii="Cambria Math" w:hAnsi="Cambria Math" w:cs="Cambria Math"/>
+          <w:b/>
+          <w:sz w:val="14"/>
+          <w:szCs w:val="14"/>
+          <w:shd w:val="clear" w:color="auto" w:fill="B7B7B7"/>
+        </w:rPr>
+        <w:t>‑</w:t>
+      </w:r>
+      <w:r>
+        <w:rPr>
+          <w:b/>
+          <w:sz w:val="14"/>
+          <w:szCs w:val="14"/>
+          <w:shd w:val="clear" w:color="auto" w:fill="B7B7B7"/>
+        </w:rPr>
+        <w:t>5 Mini) at [8/14/2025]</w:t>
       </w:r>
     </w:p>
     <w:p>
@@ -1237,7 +1295,6 @@
           <w:rFonts w:ascii="Roboto Mono" w:eastAsia="Roboto Mono" w:hAnsi="Roboto Mono" w:cs="Roboto Mono"/>
           <w:b/>
         </w:rPr>
-        <w:lastRenderedPageBreak/>
         <w:t>Example:</w:t>
       </w:r>
       <w:r>
@@ -1252,7 +1309,7 @@
     </w:p>
     <w:p>
       <w:r>
-        <w:pict w14:anchorId="43D49343">
+        <w:pict w14:anchorId="5D3AC20A">
           <v:rect id="_x0000_i1030" style="width:0;height:1.5pt" o:hralign="center" o:hrstd="t" o:hr="t" fillcolor="#a0a0a0" stroked="f"/>
         </w:pict>
       </w:r>
@@ -1278,6 +1335,7 @@
           <w:b/>
           <w:shd w:val="clear" w:color="auto" w:fill="B7B7B7"/>
         </w:rPr>
+        <w:lastRenderedPageBreak/>
         <w:t># Source</w:t>
       </w:r>
       <w:r>
@@ -1286,21 +1344,12 @@
         </w:rPr>
         <w:t xml:space="preserve">: </w:t>
       </w:r>
-      <w:proofErr w:type="spellStart"/>
-      <w:r>
-        <w:rPr>
-          <w:b/>
-          <w:shd w:val="clear" w:color="auto" w:fill="B7B7B7"/>
-        </w:rPr>
-        <w:t>Chatgpt</w:t>
-      </w:r>
-      <w:proofErr w:type="spellEnd"/>
-      <w:r>
-        <w:rPr>
-          <w:b/>
-          <w:shd w:val="clear" w:color="auto" w:fill="B7B7B7"/>
-        </w:rPr>
-        <w:t xml:space="preserve"> </w:t>
+      <w:r>
+        <w:rPr>
+          <w:b/>
+          <w:shd w:val="clear" w:color="auto" w:fill="B7B7B7"/>
+        </w:rPr>
+        <w:t xml:space="preserve">Chatgpt </w:t>
       </w:r>
       <w:r>
         <w:rPr>
@@ -1309,7 +1358,26 @@
           <w:szCs w:val="14"/>
           <w:shd w:val="clear" w:color="auto" w:fill="B7B7B7"/>
         </w:rPr>
-        <w:t>(GPT-5-Standard) at [8/14/2025]</w:t>
+        <w:t>(GPT</w:t>
+      </w:r>
+      <w:r>
+        <w:rPr>
+          <w:rFonts w:ascii="Cambria Math" w:hAnsi="Cambria Math" w:cs="Cambria Math"/>
+          <w:b/>
+          <w:sz w:val="14"/>
+          <w:szCs w:val="14"/>
+          <w:shd w:val="clear" w:color="auto" w:fill="B7B7B7"/>
+        </w:rPr>
+        <w:t>‑</w:t>
+      </w:r>
+      <w:r>
+        <w:rPr>
+          <w:b/>
+          <w:sz w:val="14"/>
+          <w:szCs w:val="14"/>
+          <w:shd w:val="clear" w:color="auto" w:fill="B7B7B7"/>
+        </w:rPr>
+        <w:t>5 Mini) at [8/14/2025]</w:t>
       </w:r>
     </w:p>
     <w:p>
@@ -1438,7 +1506,7 @@
     </w:p>
     <w:p>
       <w:r>
-        <w:pict w14:anchorId="1B440D4A">
+        <w:pict w14:anchorId="3232E89A">
           <v:rect id="_x0000_i1031" style="width:0;height:1.5pt" o:hralign="center" o:hrstd="t" o:hr="t" fillcolor="#a0a0a0" stroked="f"/>
         </w:pict>
       </w:r>
@@ -1476,21 +1544,12 @@
         </w:rPr>
         <w:t xml:space="preserve">: </w:t>
       </w:r>
-      <w:proofErr w:type="spellStart"/>
-      <w:r>
-        <w:rPr>
-          <w:b/>
-          <w:shd w:val="clear" w:color="auto" w:fill="B7B7B7"/>
-        </w:rPr>
-        <w:t>Chatgpt</w:t>
-      </w:r>
-      <w:proofErr w:type="spellEnd"/>
-      <w:r>
-        <w:rPr>
-          <w:b/>
-          <w:shd w:val="clear" w:color="auto" w:fill="B7B7B7"/>
-        </w:rPr>
-        <w:t xml:space="preserve"> </w:t>
+      <w:r>
+        <w:rPr>
+          <w:b/>
+          <w:shd w:val="clear" w:color="auto" w:fill="B7B7B7"/>
+        </w:rPr>
+        <w:t xml:space="preserve">Chatgpt </w:t>
       </w:r>
       <w:r>
         <w:rPr>
@@ -1499,7 +1558,26 @@
           <w:szCs w:val="14"/>
           <w:shd w:val="clear" w:color="auto" w:fill="B7B7B7"/>
         </w:rPr>
-        <w:t>(GPT-5-Standard) at [8/14/2025]</w:t>
+        <w:t>(GPT</w:t>
+      </w:r>
+      <w:r>
+        <w:rPr>
+          <w:rFonts w:ascii="Cambria Math" w:hAnsi="Cambria Math" w:cs="Cambria Math"/>
+          <w:b/>
+          <w:sz w:val="14"/>
+          <w:szCs w:val="14"/>
+          <w:shd w:val="clear" w:color="auto" w:fill="B7B7B7"/>
+        </w:rPr>
+        <w:t>‑</w:t>
+      </w:r>
+      <w:r>
+        <w:rPr>
+          <w:b/>
+          <w:sz w:val="14"/>
+          <w:szCs w:val="14"/>
+          <w:shd w:val="clear" w:color="auto" w:fill="B7B7B7"/>
+        </w:rPr>
+        <w:t>5 Mini) at [8/14/2025]</w:t>
       </w:r>
     </w:p>
     <w:p>
@@ -1544,7 +1622,7 @@
     </w:p>
     <w:p>
       <w:r>
-        <w:pict w14:anchorId="5E1D68FF">
+        <w:pict w14:anchorId="66123628">
           <v:rect id="_x0000_i1032" style="width:0;height:1.5pt" o:hralign="center" o:hrstd="t" o:hr="t" fillcolor="#a0a0a0" stroked="f"/>
         </w:pict>
       </w:r>
@@ -1563,7 +1641,7 @@
     </w:p>
     <w:p>
       <w:r>
-        <w:pict w14:anchorId="1404E1B3">
+        <w:pict w14:anchorId="63B4910B">
           <v:rect id="_x0000_i1033" style="width:0;height:1.5pt" o:hralign="center" o:hrstd="t" o:hr="t" fillcolor="#a0a0a0" stroked="f"/>
         </w:pict>
       </w:r>
@@ -1610,21 +1688,12 @@
         </w:rPr>
         <w:t xml:space="preserve">: </w:t>
       </w:r>
-      <w:proofErr w:type="spellStart"/>
-      <w:r>
-        <w:rPr>
-          <w:b/>
-          <w:shd w:val="clear" w:color="auto" w:fill="B7B7B7"/>
-        </w:rPr>
-        <w:t>Chatgpt</w:t>
-      </w:r>
-      <w:proofErr w:type="spellEnd"/>
-      <w:r>
-        <w:rPr>
-          <w:b/>
-          <w:shd w:val="clear" w:color="auto" w:fill="B7B7B7"/>
-        </w:rPr>
-        <w:t xml:space="preserve"> </w:t>
+      <w:r>
+        <w:rPr>
+          <w:b/>
+          <w:shd w:val="clear" w:color="auto" w:fill="B7B7B7"/>
+        </w:rPr>
+        <w:t xml:space="preserve">Chatgpt </w:t>
       </w:r>
       <w:r>
         <w:rPr>
@@ -1633,7 +1702,26 @@
           <w:szCs w:val="14"/>
           <w:shd w:val="clear" w:color="auto" w:fill="B7B7B7"/>
         </w:rPr>
-        <w:t>(GPT-5-Standard) at [8/14/2025]</w:t>
+        <w:t>(GPT</w:t>
+      </w:r>
+      <w:r>
+        <w:rPr>
+          <w:rFonts w:ascii="Cambria Math" w:hAnsi="Cambria Math" w:cs="Cambria Math"/>
+          <w:b/>
+          <w:sz w:val="14"/>
+          <w:szCs w:val="14"/>
+          <w:shd w:val="clear" w:color="auto" w:fill="B7B7B7"/>
+        </w:rPr>
+        <w:t>‑</w:t>
+      </w:r>
+      <w:r>
+        <w:rPr>
+          <w:b/>
+          <w:sz w:val="14"/>
+          <w:szCs w:val="14"/>
+          <w:shd w:val="clear" w:color="auto" w:fill="B7B7B7"/>
+        </w:rPr>
+        <w:t>5 Mini) at [8/14/2025]</w:t>
       </w:r>
     </w:p>
     <w:p>
@@ -1649,7 +1737,6 @@
           <w:rFonts w:ascii="Roboto Mono" w:eastAsia="Roboto Mono" w:hAnsi="Roboto Mono" w:cs="Roboto Mono"/>
           <w:b/>
         </w:rPr>
-        <w:lastRenderedPageBreak/>
         <w:t>Artifact:</w:t>
       </w:r>
       <w:r>
@@ -1729,6 +1816,7 @@
           <w:rFonts w:ascii="Roboto Mono" w:eastAsia="Roboto Mono" w:hAnsi="Roboto Mono" w:cs="Roboto Mono"/>
           <w:b/>
         </w:rPr>
+        <w:lastRenderedPageBreak/>
         <w:t>Author:</w:t>
       </w:r>
       <w:r>
@@ -1855,7 +1943,7 @@
     </w:p>
     <w:p>
       <w:r>
-        <w:pict w14:anchorId="75D46EFE">
+        <w:pict w14:anchorId="212D3E25">
           <v:rect id="_x0000_i1034" style="width:0;height:1.5pt" o:hralign="center" o:hrstd="t" o:hr="t" fillcolor="#a0a0a0" stroked="f"/>
         </w:pict>
       </w:r>
@@ -1902,21 +1990,12 @@
         </w:rPr>
         <w:t xml:space="preserve">: </w:t>
       </w:r>
-      <w:proofErr w:type="spellStart"/>
-      <w:r>
-        <w:rPr>
-          <w:b/>
-          <w:shd w:val="clear" w:color="auto" w:fill="B7B7B7"/>
-        </w:rPr>
-        <w:t>Chatgpt</w:t>
-      </w:r>
-      <w:proofErr w:type="spellEnd"/>
-      <w:r>
-        <w:rPr>
-          <w:b/>
-          <w:shd w:val="clear" w:color="auto" w:fill="B7B7B7"/>
-        </w:rPr>
-        <w:t xml:space="preserve"> </w:t>
+      <w:r>
+        <w:rPr>
+          <w:b/>
+          <w:shd w:val="clear" w:color="auto" w:fill="B7B7B7"/>
+        </w:rPr>
+        <w:t xml:space="preserve">Chatgpt </w:t>
       </w:r>
       <w:r>
         <w:rPr>
@@ -1925,7 +2004,26 @@
           <w:szCs w:val="14"/>
           <w:shd w:val="clear" w:color="auto" w:fill="B7B7B7"/>
         </w:rPr>
-        <w:t>(GPT-5-Standard) at [8/14/2025]</w:t>
+        <w:t>(GPT</w:t>
+      </w:r>
+      <w:r>
+        <w:rPr>
+          <w:rFonts w:ascii="Cambria Math" w:hAnsi="Cambria Math" w:cs="Cambria Math"/>
+          <w:b/>
+          <w:sz w:val="14"/>
+          <w:szCs w:val="14"/>
+          <w:shd w:val="clear" w:color="auto" w:fill="B7B7B7"/>
+        </w:rPr>
+        <w:t>‑</w:t>
+      </w:r>
+      <w:r>
+        <w:rPr>
+          <w:b/>
+          <w:sz w:val="14"/>
+          <w:szCs w:val="14"/>
+          <w:shd w:val="clear" w:color="auto" w:fill="B7B7B7"/>
+        </w:rPr>
+        <w:t>5 Mini) at [8/14/2025]</w:t>
       </w:r>
     </w:p>
     <w:p>
@@ -2083,7 +2181,7 @@
     </w:p>
     <w:p>
       <w:r>
-        <w:pict w14:anchorId="41BFFA38">
+        <w:pict w14:anchorId="5FB5E18A">
           <v:rect id="_x0000_i1035" style="width:0;height:1.5pt" o:hralign="center" o:hrstd="t" o:hr="t" fillcolor="#a0a0a0" stroked="f"/>
         </w:pict>
       </w:r>
@@ -2110,7 +2208,6 @@
           <w:sz w:val="26"/>
           <w:szCs w:val="26"/>
         </w:rPr>
-        <w:lastRenderedPageBreak/>
         <w:t>3. Individual Preparation</w:t>
       </w:r>
     </w:p>
@@ -2131,21 +2228,12 @@
         </w:rPr>
         <w:t xml:space="preserve">: </w:t>
       </w:r>
-      <w:proofErr w:type="spellStart"/>
-      <w:r>
-        <w:rPr>
-          <w:b/>
-          <w:shd w:val="clear" w:color="auto" w:fill="B7B7B7"/>
-        </w:rPr>
-        <w:t>Chatgpt</w:t>
-      </w:r>
-      <w:proofErr w:type="spellEnd"/>
-      <w:r>
-        <w:rPr>
-          <w:b/>
-          <w:shd w:val="clear" w:color="auto" w:fill="B7B7B7"/>
-        </w:rPr>
-        <w:t xml:space="preserve"> </w:t>
+      <w:r>
+        <w:rPr>
+          <w:b/>
+          <w:shd w:val="clear" w:color="auto" w:fill="B7B7B7"/>
+        </w:rPr>
+        <w:t xml:space="preserve">Chatgpt </w:t>
       </w:r>
       <w:r>
         <w:rPr>
@@ -2154,7 +2242,26 @@
           <w:szCs w:val="14"/>
           <w:shd w:val="clear" w:color="auto" w:fill="B7B7B7"/>
         </w:rPr>
-        <w:t>(GPT-5-Standard) at [8/14/2025]</w:t>
+        <w:t>(GPT</w:t>
+      </w:r>
+      <w:r>
+        <w:rPr>
+          <w:rFonts w:ascii="Cambria Math" w:hAnsi="Cambria Math" w:cs="Cambria Math"/>
+          <w:b/>
+          <w:sz w:val="14"/>
+          <w:szCs w:val="14"/>
+          <w:shd w:val="clear" w:color="auto" w:fill="B7B7B7"/>
+        </w:rPr>
+        <w:t>‑</w:t>
+      </w:r>
+      <w:r>
+        <w:rPr>
+          <w:b/>
+          <w:sz w:val="14"/>
+          <w:szCs w:val="14"/>
+          <w:shd w:val="clear" w:color="auto" w:fill="B7B7B7"/>
+        </w:rPr>
+        <w:t>5 Mini) at [8/14/2025]</w:t>
       </w:r>
     </w:p>
     <w:p>
@@ -2197,6 +2304,7 @@
           <w:rFonts w:ascii="Roboto Mono" w:eastAsia="Roboto Mono" w:hAnsi="Roboto Mono" w:cs="Roboto Mono"/>
           <w:b/>
         </w:rPr>
+        <w:lastRenderedPageBreak/>
         <w:t>Lina</w:t>
       </w:r>
       <w:r>
@@ -2292,7 +2400,7 @@
     </w:p>
     <w:p>
       <w:r>
-        <w:pict w14:anchorId="050D8E78">
+        <w:pict w14:anchorId="5F9A4BA4">
           <v:rect id="_x0000_i1036" style="width:0;height:1.5pt" o:hralign="center" o:hrstd="t" o:hr="t" fillcolor="#a0a0a0" stroked="f"/>
         </w:pict>
       </w:r>
@@ -2339,21 +2447,12 @@
         </w:rPr>
         <w:t xml:space="preserve">: </w:t>
       </w:r>
-      <w:proofErr w:type="spellStart"/>
-      <w:r>
-        <w:rPr>
-          <w:b/>
-          <w:shd w:val="clear" w:color="auto" w:fill="B7B7B7"/>
-        </w:rPr>
-        <w:t>Chatgpt</w:t>
-      </w:r>
-      <w:proofErr w:type="spellEnd"/>
-      <w:r>
-        <w:rPr>
-          <w:b/>
-          <w:shd w:val="clear" w:color="auto" w:fill="B7B7B7"/>
-        </w:rPr>
-        <w:t xml:space="preserve"> </w:t>
+      <w:r>
+        <w:rPr>
+          <w:b/>
+          <w:shd w:val="clear" w:color="auto" w:fill="B7B7B7"/>
+        </w:rPr>
+        <w:t xml:space="preserve">Chatgpt </w:t>
       </w:r>
       <w:r>
         <w:rPr>
@@ -2362,7 +2461,26 @@
           <w:szCs w:val="14"/>
           <w:shd w:val="clear" w:color="auto" w:fill="B7B7B7"/>
         </w:rPr>
-        <w:t>(GPT-5-Standard) at [8/14/2025]</w:t>
+        <w:t>(GPT</w:t>
+      </w:r>
+      <w:r>
+        <w:rPr>
+          <w:rFonts w:ascii="Cambria Math" w:hAnsi="Cambria Math" w:cs="Cambria Math"/>
+          <w:b/>
+          <w:sz w:val="14"/>
+          <w:szCs w:val="14"/>
+          <w:shd w:val="clear" w:color="auto" w:fill="B7B7B7"/>
+        </w:rPr>
+        <w:t>‑</w:t>
+      </w:r>
+      <w:r>
+        <w:rPr>
+          <w:b/>
+          <w:sz w:val="14"/>
+          <w:szCs w:val="14"/>
+          <w:shd w:val="clear" w:color="auto" w:fill="B7B7B7"/>
+        </w:rPr>
+        <w:t>5 Mini) at [8/14/2025]</w:t>
       </w:r>
     </w:p>
     <w:p>
@@ -2489,7 +2607,7 @@
     </w:p>
     <w:p>
       <w:r>
-        <w:pict w14:anchorId="774C5BF5">
+        <w:pict w14:anchorId="3D54AA9F">
           <v:rect id="_x0000_i1037" style="width:0;height:1.5pt" o:hralign="center" o:hrstd="t" o:hr="t" fillcolor="#a0a0a0" stroked="f"/>
         </w:pict>
       </w:r>
@@ -2528,7 +2646,6 @@
           <w:b/>
           <w:shd w:val="clear" w:color="auto" w:fill="B7B7B7"/>
         </w:rPr>
-        <w:lastRenderedPageBreak/>
         <w:t># Source</w:t>
       </w:r>
       <w:r>
@@ -2537,21 +2654,12 @@
         </w:rPr>
         <w:t xml:space="preserve">: </w:t>
       </w:r>
-      <w:proofErr w:type="spellStart"/>
-      <w:r>
-        <w:rPr>
-          <w:b/>
-          <w:shd w:val="clear" w:color="auto" w:fill="B7B7B7"/>
-        </w:rPr>
-        <w:t>Chatgpt</w:t>
-      </w:r>
-      <w:proofErr w:type="spellEnd"/>
-      <w:r>
-        <w:rPr>
-          <w:b/>
-          <w:shd w:val="clear" w:color="auto" w:fill="B7B7B7"/>
-        </w:rPr>
-        <w:t xml:space="preserve"> </w:t>
+      <w:r>
+        <w:rPr>
+          <w:b/>
+          <w:shd w:val="clear" w:color="auto" w:fill="B7B7B7"/>
+        </w:rPr>
+        <w:t xml:space="preserve">Chatgpt </w:t>
       </w:r>
       <w:r>
         <w:rPr>
@@ -2560,7 +2668,26 @@
           <w:szCs w:val="14"/>
           <w:shd w:val="clear" w:color="auto" w:fill="B7B7B7"/>
         </w:rPr>
-        <w:t>(GPT-5-Standard) at [8/14/2025]</w:t>
+        <w:t>(GPT</w:t>
+      </w:r>
+      <w:r>
+        <w:rPr>
+          <w:rFonts w:ascii="Cambria Math" w:hAnsi="Cambria Math" w:cs="Cambria Math"/>
+          <w:b/>
+          <w:sz w:val="14"/>
+          <w:szCs w:val="14"/>
+          <w:shd w:val="clear" w:color="auto" w:fill="B7B7B7"/>
+        </w:rPr>
+        <w:t>‑</w:t>
+      </w:r>
+      <w:r>
+        <w:rPr>
+          <w:b/>
+          <w:sz w:val="14"/>
+          <w:szCs w:val="14"/>
+          <w:shd w:val="clear" w:color="auto" w:fill="B7B7B7"/>
+        </w:rPr>
+        <w:t>5 Mini) at [8/14/2025]</w:t>
       </w:r>
     </w:p>
     <w:p>
@@ -2635,6 +2762,7 @@
         <w:rPr>
           <w:rFonts w:ascii="Roboto Mono" w:eastAsia="Roboto Mono" w:hAnsi="Roboto Mono" w:cs="Roboto Mono"/>
         </w:rPr>
+        <w:lastRenderedPageBreak/>
         <w:t xml:space="preserve">Documents </w:t>
       </w:r>
       <w:r>
@@ -2716,7 +2844,7 @@
     </w:p>
     <w:p>
       <w:r>
-        <w:pict w14:anchorId="593BF1EB">
+        <w:pict w14:anchorId="742259A5">
           <v:rect id="_x0000_i1038" style="width:0;height:1.5pt" o:hralign="center" o:hrstd="t" o:hr="t" fillcolor="#a0a0a0" stroked="f"/>
         </w:pict>
       </w:r>
@@ -2763,21 +2891,12 @@
         </w:rPr>
         <w:t xml:space="preserve">: </w:t>
       </w:r>
-      <w:proofErr w:type="spellStart"/>
-      <w:r>
-        <w:rPr>
-          <w:b/>
-          <w:shd w:val="clear" w:color="auto" w:fill="B7B7B7"/>
-        </w:rPr>
-        <w:t>Chatgpt</w:t>
-      </w:r>
-      <w:proofErr w:type="spellEnd"/>
-      <w:r>
-        <w:rPr>
-          <w:b/>
-          <w:shd w:val="clear" w:color="auto" w:fill="B7B7B7"/>
-        </w:rPr>
-        <w:t xml:space="preserve"> </w:t>
+      <w:r>
+        <w:rPr>
+          <w:b/>
+          <w:shd w:val="clear" w:color="auto" w:fill="B7B7B7"/>
+        </w:rPr>
+        <w:t xml:space="preserve">Chatgpt </w:t>
       </w:r>
       <w:r>
         <w:rPr>
@@ -2786,7 +2905,26 @@
           <w:szCs w:val="14"/>
           <w:shd w:val="clear" w:color="auto" w:fill="B7B7B7"/>
         </w:rPr>
-        <w:t>(GPT-5-Standard) at [8/14/2025]</w:t>
+        <w:t>(GPT</w:t>
+      </w:r>
+      <w:r>
+        <w:rPr>
+          <w:rFonts w:ascii="Cambria Math" w:hAnsi="Cambria Math" w:cs="Cambria Math"/>
+          <w:b/>
+          <w:sz w:val="14"/>
+          <w:szCs w:val="14"/>
+          <w:shd w:val="clear" w:color="auto" w:fill="B7B7B7"/>
+        </w:rPr>
+        <w:t>‑</w:t>
+      </w:r>
+      <w:r>
+        <w:rPr>
+          <w:b/>
+          <w:sz w:val="14"/>
+          <w:szCs w:val="14"/>
+          <w:shd w:val="clear" w:color="auto" w:fill="B7B7B7"/>
+        </w:rPr>
+        <w:t>5 Mini) at [8/14/2025]</w:t>
       </w:r>
     </w:p>
     <w:p>
@@ -2874,7 +3012,7 @@
     </w:p>
     <w:p>
       <w:r>
-        <w:pict w14:anchorId="1D842DB0">
+        <w:pict w14:anchorId="64D5FE82">
           <v:rect id="_x0000_i1039" style="width:0;height:1.5pt" o:hralign="center" o:hrstd="t" o:hr="t" fillcolor="#a0a0a0" stroked="f"/>
         </w:pict>
       </w:r>
@@ -2921,7 +3059,7 @@
     </w:p>
     <w:p>
       <w:r>
-        <w:pict w14:anchorId="73C2C780">
+        <w:pict w14:anchorId="0091ACE7">
           <v:rect id="_x0000_i1040" style="width:0;height:1.5pt" o:hralign="center" o:hrstd="t" o:hr="t" fillcolor="#a0a0a0" stroked="f"/>
         </w:pict>
       </w:r>
@@ -2958,21 +3096,12 @@
         </w:rPr>
         <w:t xml:space="preserve">: </w:t>
       </w:r>
-      <w:proofErr w:type="spellStart"/>
-      <w:r>
-        <w:rPr>
-          <w:b/>
-          <w:shd w:val="clear" w:color="auto" w:fill="B7B7B7"/>
-        </w:rPr>
-        <w:t>Chatgpt</w:t>
-      </w:r>
-      <w:proofErr w:type="spellEnd"/>
-      <w:r>
-        <w:rPr>
-          <w:b/>
-          <w:shd w:val="clear" w:color="auto" w:fill="B7B7B7"/>
-        </w:rPr>
-        <w:t xml:space="preserve"> </w:t>
+      <w:r>
+        <w:rPr>
+          <w:b/>
+          <w:shd w:val="clear" w:color="auto" w:fill="B7B7B7"/>
+        </w:rPr>
+        <w:t xml:space="preserve">Chatgpt </w:t>
       </w:r>
       <w:r>
         <w:rPr>
@@ -2981,7 +3110,26 @@
           <w:szCs w:val="14"/>
           <w:shd w:val="clear" w:color="auto" w:fill="B7B7B7"/>
         </w:rPr>
-        <w:t>(GPT-5-Standard) at [8/14/2025]</w:t>
+        <w:t>(GPT</w:t>
+      </w:r>
+      <w:r>
+        <w:rPr>
+          <w:rFonts w:ascii="Cambria Math" w:hAnsi="Cambria Math" w:cs="Cambria Math"/>
+          <w:b/>
+          <w:sz w:val="14"/>
+          <w:szCs w:val="14"/>
+          <w:shd w:val="clear" w:color="auto" w:fill="B7B7B7"/>
+        </w:rPr>
+        <w:t>‑</w:t>
+      </w:r>
+      <w:r>
+        <w:rPr>
+          <w:b/>
+          <w:sz w:val="14"/>
+          <w:szCs w:val="14"/>
+          <w:shd w:val="clear" w:color="auto" w:fill="B7B7B7"/>
+        </w:rPr>
+        <w:t>5 Mini) at [8/14/2025]</w:t>
       </w:r>
     </w:p>
     <w:p>
@@ -3013,8 +3161,7 @@
     </w:p>
     <w:p>
       <w:r>
-        <w:lastRenderedPageBreak/>
-        <w:pict w14:anchorId="2EA71CF9">
+        <w:pict w14:anchorId="6FA2CE11">
           <v:rect id="_x0000_i1041" style="width:0;height:1.5pt" o:hralign="center" o:hrstd="t" o:hr="t" fillcolor="#a0a0a0" stroked="f"/>
         </w:pict>
       </w:r>
@@ -3061,21 +3208,12 @@
         </w:rPr>
         <w:t xml:space="preserve">: </w:t>
       </w:r>
-      <w:proofErr w:type="spellStart"/>
-      <w:r>
-        <w:rPr>
-          <w:b/>
-          <w:shd w:val="clear" w:color="auto" w:fill="B7B7B7"/>
-        </w:rPr>
-        <w:t>Chatgpt</w:t>
-      </w:r>
-      <w:proofErr w:type="spellEnd"/>
-      <w:r>
-        <w:rPr>
-          <w:b/>
-          <w:shd w:val="clear" w:color="auto" w:fill="B7B7B7"/>
-        </w:rPr>
-        <w:t xml:space="preserve"> </w:t>
+      <w:r>
+        <w:rPr>
+          <w:b/>
+          <w:shd w:val="clear" w:color="auto" w:fill="B7B7B7"/>
+        </w:rPr>
+        <w:t xml:space="preserve">Chatgpt </w:t>
       </w:r>
       <w:r>
         <w:rPr>
@@ -3084,7 +3222,26 @@
           <w:szCs w:val="14"/>
           <w:shd w:val="clear" w:color="auto" w:fill="B7B7B7"/>
         </w:rPr>
-        <w:t>(GPT-5-Standard) at [8/14/2025]</w:t>
+        <w:t>(GPT</w:t>
+      </w:r>
+      <w:r>
+        <w:rPr>
+          <w:rFonts w:ascii="Cambria Math" w:hAnsi="Cambria Math" w:cs="Cambria Math"/>
+          <w:b/>
+          <w:sz w:val="14"/>
+          <w:szCs w:val="14"/>
+          <w:shd w:val="clear" w:color="auto" w:fill="B7B7B7"/>
+        </w:rPr>
+        <w:t>‑</w:t>
+      </w:r>
+      <w:r>
+        <w:rPr>
+          <w:b/>
+          <w:sz w:val="14"/>
+          <w:szCs w:val="14"/>
+          <w:shd w:val="clear" w:color="auto" w:fill="B7B7B7"/>
+        </w:rPr>
+        <w:t>5 Mini) at [8/14/2025]</w:t>
       </w:r>
     </w:p>
     <w:p>
@@ -3099,6 +3256,7 @@
         <w:rPr>
           <w:rFonts w:ascii="Roboto Mono" w:eastAsia="Roboto Mono" w:hAnsi="Roboto Mono" w:cs="Roboto Mono"/>
         </w:rPr>
+        <w:lastRenderedPageBreak/>
         <w:t xml:space="preserve">The </w:t>
       </w:r>
       <w:r>
@@ -3207,7 +3365,7 @@
     </w:p>
     <w:p>
       <w:r>
-        <w:pict w14:anchorId="7377FB35">
+        <w:pict w14:anchorId="53C84C33">
           <v:rect id="_x0000_i1042" style="width:0;height:1.5pt" o:hralign="center" o:hrstd="t" o:hr="t" fillcolor="#a0a0a0" stroked="f"/>
         </w:pict>
       </w:r>
@@ -3254,21 +3412,12 @@
         </w:rPr>
         <w:t xml:space="preserve">: </w:t>
       </w:r>
-      <w:proofErr w:type="spellStart"/>
-      <w:r>
-        <w:rPr>
-          <w:b/>
-          <w:shd w:val="clear" w:color="auto" w:fill="B7B7B7"/>
-        </w:rPr>
-        <w:t>Chatgpt</w:t>
-      </w:r>
-      <w:proofErr w:type="spellEnd"/>
-      <w:r>
-        <w:rPr>
-          <w:b/>
-          <w:shd w:val="clear" w:color="auto" w:fill="B7B7B7"/>
-        </w:rPr>
-        <w:t xml:space="preserve"> </w:t>
+      <w:r>
+        <w:rPr>
+          <w:b/>
+          <w:shd w:val="clear" w:color="auto" w:fill="B7B7B7"/>
+        </w:rPr>
+        <w:t xml:space="preserve">Chatgpt </w:t>
       </w:r>
       <w:r>
         <w:rPr>
@@ -3277,7 +3426,26 @@
           <w:szCs w:val="14"/>
           <w:shd w:val="clear" w:color="auto" w:fill="B7B7B7"/>
         </w:rPr>
-        <w:t>(GPT-5-Standard) at [8/14/2025]</w:t>
+        <w:t>(GPT</w:t>
+      </w:r>
+      <w:r>
+        <w:rPr>
+          <w:rFonts w:ascii="Cambria Math" w:hAnsi="Cambria Math" w:cs="Cambria Math"/>
+          <w:b/>
+          <w:sz w:val="14"/>
+          <w:szCs w:val="14"/>
+          <w:shd w:val="clear" w:color="auto" w:fill="B7B7B7"/>
+        </w:rPr>
+        <w:t>‑</w:t>
+      </w:r>
+      <w:r>
+        <w:rPr>
+          <w:b/>
+          <w:sz w:val="14"/>
+          <w:szCs w:val="14"/>
+          <w:shd w:val="clear" w:color="auto" w:fill="B7B7B7"/>
+        </w:rPr>
+        <w:t>5 Mini) at [8/14/2025]</w:t>
       </w:r>
     </w:p>
     <w:p>
@@ -3423,7 +3591,7 @@
     </w:p>
     <w:p>
       <w:r>
-        <w:pict w14:anchorId="1B1604C0">
+        <w:pict w14:anchorId="462026CE">
           <v:rect id="_x0000_i1043" style="width:0;height:1.5pt" o:hralign="center" o:hrstd="t" o:hr="t" fillcolor="#a0a0a0" stroked="f"/>
         </w:pict>
       </w:r>
@@ -3470,21 +3638,12 @@
         </w:rPr>
         <w:t xml:space="preserve">: </w:t>
       </w:r>
-      <w:proofErr w:type="spellStart"/>
-      <w:r>
-        <w:rPr>
-          <w:b/>
-          <w:shd w:val="clear" w:color="auto" w:fill="B7B7B7"/>
-        </w:rPr>
-        <w:t>Chatgpt</w:t>
-      </w:r>
-      <w:proofErr w:type="spellEnd"/>
-      <w:r>
-        <w:rPr>
-          <w:b/>
-          <w:shd w:val="clear" w:color="auto" w:fill="B7B7B7"/>
-        </w:rPr>
-        <w:t xml:space="preserve"> </w:t>
+      <w:r>
+        <w:rPr>
+          <w:b/>
+          <w:shd w:val="clear" w:color="auto" w:fill="B7B7B7"/>
+        </w:rPr>
+        <w:t xml:space="preserve">Chatgpt </w:t>
       </w:r>
       <w:r>
         <w:rPr>
@@ -3493,7 +3652,26 @@
           <w:szCs w:val="14"/>
           <w:shd w:val="clear" w:color="auto" w:fill="B7B7B7"/>
         </w:rPr>
-        <w:t>(GPT-5-Standard) at [8/14/2025]</w:t>
+        <w:t>(GPT</w:t>
+      </w:r>
+      <w:r>
+        <w:rPr>
+          <w:rFonts w:ascii="Cambria Math" w:hAnsi="Cambria Math" w:cs="Cambria Math"/>
+          <w:b/>
+          <w:sz w:val="14"/>
+          <w:szCs w:val="14"/>
+          <w:shd w:val="clear" w:color="auto" w:fill="B7B7B7"/>
+        </w:rPr>
+        <w:t>‑</w:t>
+      </w:r>
+      <w:r>
+        <w:rPr>
+          <w:b/>
+          <w:sz w:val="14"/>
+          <w:szCs w:val="14"/>
+          <w:shd w:val="clear" w:color="auto" w:fill="B7B7B7"/>
+        </w:rPr>
+        <w:t>5 Mini) at [8/14/2025]</w:t>
       </w:r>
     </w:p>
     <w:p>
@@ -3538,7 +3716,6 @@
         <w:rPr>
           <w:rFonts w:ascii="Roboto Mono" w:eastAsia="Roboto Mono" w:hAnsi="Roboto Mono" w:cs="Roboto Mono"/>
         </w:rPr>
-        <w:lastRenderedPageBreak/>
         <w:t>Vendor questionnaires for payment gateway PCI DSS certification.</w:t>
       </w:r>
       <w:r>
@@ -3563,6 +3740,7 @@
         <w:rPr>
           <w:rFonts w:ascii="Roboto Mono" w:eastAsia="Roboto Mono" w:hAnsi="Roboto Mono" w:cs="Roboto Mono"/>
         </w:rPr>
+        <w:lastRenderedPageBreak/>
         <w:t>Automated static scanning scripts for encryption verification.</w:t>
       </w:r>
       <w:r>
@@ -3574,7 +3752,7 @@
     </w:p>
     <w:p>
       <w:r>
-        <w:pict w14:anchorId="10A4BF4A">
+        <w:pict w14:anchorId="5A7D845A">
           <v:rect id="_x0000_i1044" style="width:0;height:1.5pt" o:hralign="center" o:hrstd="t" o:hr="t" fillcolor="#a0a0a0" stroked="f"/>
         </w:pict>
       </w:r>
@@ -3621,21 +3799,12 @@
         </w:rPr>
         <w:t xml:space="preserve">: </w:t>
       </w:r>
-      <w:proofErr w:type="spellStart"/>
-      <w:r>
-        <w:rPr>
-          <w:b/>
-          <w:shd w:val="clear" w:color="auto" w:fill="B7B7B7"/>
-        </w:rPr>
-        <w:t>Chatgpt</w:t>
-      </w:r>
-      <w:proofErr w:type="spellEnd"/>
-      <w:r>
-        <w:rPr>
-          <w:b/>
-          <w:shd w:val="clear" w:color="auto" w:fill="B7B7B7"/>
-        </w:rPr>
-        <w:t xml:space="preserve"> </w:t>
+      <w:r>
+        <w:rPr>
+          <w:b/>
+          <w:shd w:val="clear" w:color="auto" w:fill="B7B7B7"/>
+        </w:rPr>
+        <w:t xml:space="preserve">Chatgpt </w:t>
       </w:r>
       <w:r>
         <w:rPr>
@@ -3644,7 +3813,26 @@
           <w:szCs w:val="14"/>
           <w:shd w:val="clear" w:color="auto" w:fill="B7B7B7"/>
         </w:rPr>
-        <w:t>(GPT-5-Standard) at [8/14/2025]</w:t>
+        <w:t>(GPT</w:t>
+      </w:r>
+      <w:r>
+        <w:rPr>
+          <w:rFonts w:ascii="Cambria Math" w:hAnsi="Cambria Math" w:cs="Cambria Math"/>
+          <w:b/>
+          <w:sz w:val="14"/>
+          <w:szCs w:val="14"/>
+          <w:shd w:val="clear" w:color="auto" w:fill="B7B7B7"/>
+        </w:rPr>
+        <w:t>‑</w:t>
+      </w:r>
+      <w:r>
+        <w:rPr>
+          <w:b/>
+          <w:sz w:val="14"/>
+          <w:szCs w:val="14"/>
+          <w:shd w:val="clear" w:color="auto" w:fill="B7B7B7"/>
+        </w:rPr>
+        <w:t>5 Mini) at [8/14/2025]</w:t>
       </w:r>
     </w:p>
     <w:p>
@@ -3734,7 +3922,7 @@
     </w:p>
     <w:p>
       <w:r>
-        <w:pict w14:anchorId="04101CB2">
+        <w:pict w14:anchorId="1C4B5088">
           <v:rect id="_x0000_i1045" style="width:0;height:1.5pt" o:hralign="center" o:hrstd="t" o:hr="t" fillcolor="#a0a0a0" stroked="f"/>
         </w:pict>
       </w:r>
@@ -3781,21 +3969,12 @@
         </w:rPr>
         <w:t xml:space="preserve">: </w:t>
       </w:r>
-      <w:proofErr w:type="spellStart"/>
-      <w:r>
-        <w:rPr>
-          <w:b/>
-          <w:shd w:val="clear" w:color="auto" w:fill="B7B7B7"/>
-        </w:rPr>
-        <w:t>Chatgpt</w:t>
-      </w:r>
-      <w:proofErr w:type="spellEnd"/>
-      <w:r>
-        <w:rPr>
-          <w:b/>
-          <w:shd w:val="clear" w:color="auto" w:fill="B7B7B7"/>
-        </w:rPr>
-        <w:t xml:space="preserve"> </w:t>
+      <w:r>
+        <w:rPr>
+          <w:b/>
+          <w:shd w:val="clear" w:color="auto" w:fill="B7B7B7"/>
+        </w:rPr>
+        <w:t xml:space="preserve">Chatgpt </w:t>
       </w:r>
       <w:r>
         <w:rPr>
@@ -3804,7 +3983,26 @@
           <w:szCs w:val="14"/>
           <w:shd w:val="clear" w:color="auto" w:fill="B7B7B7"/>
         </w:rPr>
-        <w:t>(GPT-5-Standard) at [8/14/2025]</w:t>
+        <w:t>(GPT</w:t>
+      </w:r>
+      <w:r>
+        <w:rPr>
+          <w:rFonts w:ascii="Cambria Math" w:hAnsi="Cambria Math" w:cs="Cambria Math"/>
+          <w:b/>
+          <w:sz w:val="14"/>
+          <w:szCs w:val="14"/>
+          <w:shd w:val="clear" w:color="auto" w:fill="B7B7B7"/>
+        </w:rPr>
+        <w:t>‑</w:t>
+      </w:r>
+      <w:r>
+        <w:rPr>
+          <w:b/>
+          <w:sz w:val="14"/>
+          <w:szCs w:val="14"/>
+          <w:shd w:val="clear" w:color="auto" w:fill="B7B7B7"/>
+        </w:rPr>
+        <w:t>5 Mini) at [8/14/2025]</w:t>
       </w:r>
     </w:p>
     <w:p>
@@ -3897,7 +4095,7 @@
     </w:p>
     <w:p>
       <w:r>
-        <w:pict w14:anchorId="1562407D">
+        <w:pict w14:anchorId="105D3119">
           <v:rect id="_x0000_i1046" style="width:0;height:1.5pt" o:hralign="center" o:hrstd="t" o:hr="t" fillcolor="#a0a0a0" stroked="f"/>
         </w:pict>
       </w:r>
@@ -3944,21 +4142,12 @@
         </w:rPr>
         <w:t xml:space="preserve">: </w:t>
       </w:r>
-      <w:proofErr w:type="spellStart"/>
-      <w:r>
-        <w:rPr>
-          <w:b/>
-          <w:shd w:val="clear" w:color="auto" w:fill="B7B7B7"/>
-        </w:rPr>
-        <w:t>Chatgpt</w:t>
-      </w:r>
-      <w:proofErr w:type="spellEnd"/>
-      <w:r>
-        <w:rPr>
-          <w:b/>
-          <w:shd w:val="clear" w:color="auto" w:fill="B7B7B7"/>
-        </w:rPr>
-        <w:t xml:space="preserve"> </w:t>
+      <w:r>
+        <w:rPr>
+          <w:b/>
+          <w:shd w:val="clear" w:color="auto" w:fill="B7B7B7"/>
+        </w:rPr>
+        <w:t xml:space="preserve">Chatgpt </w:t>
       </w:r>
       <w:r>
         <w:rPr>
@@ -3967,7 +4156,26 @@
           <w:szCs w:val="14"/>
           <w:shd w:val="clear" w:color="auto" w:fill="B7B7B7"/>
         </w:rPr>
-        <w:t>(GPT-5-Standard) at [8/14/2025]</w:t>
+        <w:t>(GPT</w:t>
+      </w:r>
+      <w:r>
+        <w:rPr>
+          <w:rFonts w:ascii="Cambria Math" w:hAnsi="Cambria Math" w:cs="Cambria Math"/>
+          <w:b/>
+          <w:sz w:val="14"/>
+          <w:szCs w:val="14"/>
+          <w:shd w:val="clear" w:color="auto" w:fill="B7B7B7"/>
+        </w:rPr>
+        <w:t>‑</w:t>
+      </w:r>
+      <w:r>
+        <w:rPr>
+          <w:b/>
+          <w:sz w:val="14"/>
+          <w:szCs w:val="14"/>
+          <w:shd w:val="clear" w:color="auto" w:fill="B7B7B7"/>
+        </w:rPr>
+        <w:t>5 Mini) at [8/14/2025]</w:t>
       </w:r>
     </w:p>
     <w:p>
@@ -3982,7 +4190,6 @@
         <w:rPr>
           <w:rFonts w:ascii="Roboto Mono" w:eastAsia="Roboto Mono" w:hAnsi="Roboto Mono" w:cs="Roboto Mono"/>
         </w:rPr>
-        <w:lastRenderedPageBreak/>
         <w:t xml:space="preserve">Even as coding began, </w:t>
       </w:r>
       <w:r>
@@ -4019,6 +4226,7 @@
         <w:rPr>
           <w:rFonts w:ascii="Roboto Mono" w:eastAsia="Roboto Mono" w:hAnsi="Roboto Mono" w:cs="Roboto Mono"/>
         </w:rPr>
+        <w:lastRenderedPageBreak/>
         <w:t>SQL injection risks.</w:t>
       </w:r>
       <w:r>
@@ -4071,7 +4279,7 @@
     </w:p>
     <w:p>
       <w:r>
-        <w:pict w14:anchorId="1159A5E6">
+        <w:pict w14:anchorId="62314EB1">
           <v:rect id="_x0000_i1047" style="width:0;height:1.5pt" o:hralign="center" o:hrstd="t" o:hr="t" fillcolor="#a0a0a0" stroked="f"/>
         </w:pict>
       </w:r>
@@ -4132,7 +4340,7 @@
     </w:p>
     <w:p>
       <w:r>
-        <w:pict w14:anchorId="3771D0F5">
+        <w:pict w14:anchorId="18A4C880">
           <v:rect id="_x0000_i1048" style="width:0;height:1.5pt" o:hralign="center" o:hrstd="t" o:hr="t" fillcolor="#a0a0a0" stroked="f"/>
         </w:pict>
       </w:r>
@@ -4144,6 +4352,7 @@
       <w:bookmarkStart w:id="23" w:name="_84rfgyybl5gl" w:colFirst="0" w:colLast="0"/>
       <w:bookmarkEnd w:id="23"/>
     </w:p>
+    <w:p/>
     <w:sectPr>
       <w:pgSz w:w="12240" w:h="15840"/>
       <w:pgMar w:top="1440" w:right="1440" w:bottom="1440" w:left="1440" w:header="720" w:footer="720" w:gutter="0"/>
@@ -6252,15 +6461,17 @@
   <w:docDefaults>
     <w:rPrDefault>
       <w:rPr>
-        <w:rFonts w:ascii="Arial" w:eastAsia="Arial" w:hAnsi="Arial" w:cs="Arial"/>
-        <w:sz w:val="22"/>
-        <w:szCs w:val="22"/>
-        <w:lang w:val="en" w:eastAsia="en-US" w:bidi="ar-SA"/>
+        <w:rFonts w:asciiTheme="minorHAnsi" w:eastAsiaTheme="minorHAnsi" w:hAnsiTheme="minorHAnsi" w:cstheme="minorBidi"/>
+        <w:kern w:val="2"/>
+        <w:sz w:val="24"/>
+        <w:szCs w:val="24"/>
+        <w:lang w:val="en-US" w:eastAsia="en-US" w:bidi="ar-SA"/>
+        <w14:ligatures w14:val="standardContextual"/>
       </w:rPr>
     </w:rPrDefault>
     <w:pPrDefault>
       <w:pPr>
-        <w:spacing w:line="276" w:lineRule="auto"/>
+        <w:spacing w:after="160" w:line="278" w:lineRule="auto"/>
       </w:pPr>
     </w:pPrDefault>
   </w:docDefaults>
@@ -6645,20 +6856,36 @@
   <w:style w:type="paragraph" w:default="1" w:styleId="Normal">
     <w:name w:val="Normal"/>
     <w:qFormat/>
+    <w:rsid w:val="00DA13EC"/>
+    <w:pPr>
+      <w:spacing w:after="0" w:line="276" w:lineRule="auto"/>
+    </w:pPr>
+    <w:rPr>
+      <w:rFonts w:ascii="Arial" w:eastAsia="Arial" w:hAnsi="Arial" w:cs="Arial"/>
+      <w:kern w:val="0"/>
+      <w:sz w:val="22"/>
+      <w:szCs w:val="22"/>
+      <w:lang w:val="en"/>
+      <w14:ligatures w14:val="none"/>
+    </w:rPr>
   </w:style>
   <w:style w:type="paragraph" w:styleId="Heading1">
     <w:name w:val="heading 1"/>
     <w:basedOn w:val="Normal"/>
     <w:next w:val="Normal"/>
+    <w:link w:val="Heading1Char"/>
     <w:uiPriority w:val="9"/>
     <w:qFormat/>
+    <w:rsid w:val="00724C46"/>
     <w:pPr>
       <w:keepNext/>
       <w:keepLines/>
-      <w:spacing w:before="400" w:after="120"/>
+      <w:spacing w:before="360" w:after="80"/>
       <w:outlineLvl w:val="0"/>
     </w:pPr>
     <w:rPr>
+      <w:rFonts w:asciiTheme="majorHAnsi" w:eastAsiaTheme="majorEastAsia" w:hAnsiTheme="majorHAnsi" w:cstheme="majorBidi"/>
+      <w:color w:val="2F5496" w:themeColor="accent1" w:themeShade="BF"/>
       <w:sz w:val="40"/>
       <w:szCs w:val="40"/>
     </w:rPr>
@@ -6667,16 +6894,20 @@
     <w:name w:val="heading 2"/>
     <w:basedOn w:val="Normal"/>
     <w:next w:val="Normal"/>
+    <w:link w:val="Heading2Char"/>
     <w:uiPriority w:val="9"/>
     <w:unhideWhenUsed/>
     <w:qFormat/>
+    <w:rsid w:val="00724C46"/>
     <w:pPr>
       <w:keepNext/>
       <w:keepLines/>
-      <w:spacing w:before="360" w:after="120"/>
+      <w:spacing w:before="160" w:after="80"/>
       <w:outlineLvl w:val="1"/>
     </w:pPr>
     <w:rPr>
+      <w:rFonts w:asciiTheme="majorHAnsi" w:eastAsiaTheme="majorEastAsia" w:hAnsiTheme="majorHAnsi" w:cstheme="majorBidi"/>
+      <w:color w:val="2F5496" w:themeColor="accent1" w:themeShade="BF"/>
       <w:sz w:val="32"/>
       <w:szCs w:val="32"/>
     </w:rPr>
@@ -6685,17 +6916,20 @@
     <w:name w:val="heading 3"/>
     <w:basedOn w:val="Normal"/>
     <w:next w:val="Normal"/>
+    <w:link w:val="Heading3Char"/>
     <w:uiPriority w:val="9"/>
     <w:unhideWhenUsed/>
     <w:qFormat/>
+    <w:rsid w:val="00724C46"/>
     <w:pPr>
       <w:keepNext/>
       <w:keepLines/>
-      <w:spacing w:before="320" w:after="80"/>
+      <w:spacing w:before="160" w:after="80"/>
       <w:outlineLvl w:val="2"/>
     </w:pPr>
     <w:rPr>
-      <w:color w:val="434343"/>
+      <w:rFonts w:eastAsiaTheme="majorEastAsia" w:cstheme="majorBidi"/>
+      <w:color w:val="2F5496" w:themeColor="accent1" w:themeShade="BF"/>
       <w:sz w:val="28"/>
       <w:szCs w:val="28"/>
     </w:rPr>
@@ -6704,62 +6938,136 @@
     <w:name w:val="heading 4"/>
     <w:basedOn w:val="Normal"/>
     <w:next w:val="Normal"/>
+    <w:link w:val="Heading4Char"/>
     <w:uiPriority w:val="9"/>
     <w:semiHidden/>
     <w:unhideWhenUsed/>
     <w:qFormat/>
+    <w:rsid w:val="00724C46"/>
     <w:pPr>
       <w:keepNext/>
       <w:keepLines/>
-      <w:spacing w:before="280" w:after="80"/>
+      <w:spacing w:before="80" w:after="40"/>
       <w:outlineLvl w:val="3"/>
     </w:pPr>
     <w:rPr>
-      <w:color w:val="666666"/>
-      <w:sz w:val="24"/>
-      <w:szCs w:val="24"/>
+      <w:rFonts w:eastAsiaTheme="majorEastAsia" w:cstheme="majorBidi"/>
+      <w:i/>
+      <w:iCs/>
+      <w:color w:val="2F5496" w:themeColor="accent1" w:themeShade="BF"/>
     </w:rPr>
   </w:style>
   <w:style w:type="paragraph" w:styleId="Heading5">
     <w:name w:val="heading 5"/>
     <w:basedOn w:val="Normal"/>
     <w:next w:val="Normal"/>
+    <w:link w:val="Heading5Char"/>
     <w:uiPriority w:val="9"/>
     <w:semiHidden/>
     <w:unhideWhenUsed/>
     <w:qFormat/>
+    <w:rsid w:val="00724C46"/>
     <w:pPr>
       <w:keepNext/>
       <w:keepLines/>
-      <w:spacing w:before="240" w:after="80"/>
+      <w:spacing w:before="80" w:after="40"/>
       <w:outlineLvl w:val="4"/>
     </w:pPr>
     <w:rPr>
-      <w:color w:val="666666"/>
+      <w:rFonts w:eastAsiaTheme="majorEastAsia" w:cstheme="majorBidi"/>
+      <w:color w:val="2F5496" w:themeColor="accent1" w:themeShade="BF"/>
     </w:rPr>
   </w:style>
   <w:style w:type="paragraph" w:styleId="Heading6">
     <w:name w:val="heading 6"/>
     <w:basedOn w:val="Normal"/>
     <w:next w:val="Normal"/>
+    <w:link w:val="Heading6Char"/>
     <w:uiPriority w:val="9"/>
     <w:semiHidden/>
     <w:unhideWhenUsed/>
     <w:qFormat/>
+    <w:rsid w:val="00724C46"/>
     <w:pPr>
       <w:keepNext/>
       <w:keepLines/>
-      <w:spacing w:before="240" w:after="80"/>
+      <w:spacing w:before="40"/>
       <w:outlineLvl w:val="5"/>
     </w:pPr>
     <w:rPr>
+      <w:rFonts w:eastAsiaTheme="majorEastAsia" w:cstheme="majorBidi"/>
       <w:i/>
-      <w:color w:val="666666"/>
+      <w:iCs/>
+      <w:color w:val="595959" w:themeColor="text1" w:themeTint="A6"/>
+    </w:rPr>
+  </w:style>
+  <w:style w:type="paragraph" w:styleId="Heading7">
+    <w:name w:val="heading 7"/>
+    <w:basedOn w:val="Normal"/>
+    <w:next w:val="Normal"/>
+    <w:link w:val="Heading7Char"/>
+    <w:uiPriority w:val="9"/>
+    <w:semiHidden/>
+    <w:unhideWhenUsed/>
+    <w:qFormat/>
+    <w:rsid w:val="00724C46"/>
+    <w:pPr>
+      <w:keepNext/>
+      <w:keepLines/>
+      <w:spacing w:before="40"/>
+      <w:outlineLvl w:val="6"/>
+    </w:pPr>
+    <w:rPr>
+      <w:rFonts w:eastAsiaTheme="majorEastAsia" w:cstheme="majorBidi"/>
+      <w:color w:val="595959" w:themeColor="text1" w:themeTint="A6"/>
+    </w:rPr>
+  </w:style>
+  <w:style w:type="paragraph" w:styleId="Heading8">
+    <w:name w:val="heading 8"/>
+    <w:basedOn w:val="Normal"/>
+    <w:next w:val="Normal"/>
+    <w:link w:val="Heading8Char"/>
+    <w:uiPriority w:val="9"/>
+    <w:semiHidden/>
+    <w:unhideWhenUsed/>
+    <w:qFormat/>
+    <w:rsid w:val="00724C46"/>
+    <w:pPr>
+      <w:keepNext/>
+      <w:keepLines/>
+      <w:outlineLvl w:val="7"/>
+    </w:pPr>
+    <w:rPr>
+      <w:rFonts w:eastAsiaTheme="majorEastAsia" w:cstheme="majorBidi"/>
+      <w:i/>
+      <w:iCs/>
+      <w:color w:val="272727" w:themeColor="text1" w:themeTint="D8"/>
+    </w:rPr>
+  </w:style>
+  <w:style w:type="paragraph" w:styleId="Heading9">
+    <w:name w:val="heading 9"/>
+    <w:basedOn w:val="Normal"/>
+    <w:next w:val="Normal"/>
+    <w:link w:val="Heading9Char"/>
+    <w:uiPriority w:val="9"/>
+    <w:semiHidden/>
+    <w:unhideWhenUsed/>
+    <w:qFormat/>
+    <w:rsid w:val="00724C46"/>
+    <w:pPr>
+      <w:keepNext/>
+      <w:keepLines/>
+      <w:outlineLvl w:val="8"/>
+    </w:pPr>
+    <w:rPr>
+      <w:rFonts w:eastAsiaTheme="majorEastAsia" w:cstheme="majorBidi"/>
+      <w:color w:val="272727" w:themeColor="text1" w:themeTint="D8"/>
     </w:rPr>
   </w:style>
   <w:style w:type="character" w:default="1" w:styleId="DefaultParagraphFont">
     <w:name w:val="Default Paragraph Font"/>
     <w:uiPriority w:val="1"/>
+    <w:semiHidden/>
     <w:unhideWhenUsed/>
   </w:style>
   <w:style w:type="table" w:default="1" w:styleId="TableNormal">
@@ -6783,48 +7091,292 @@
     <w:semiHidden/>
     <w:unhideWhenUsed/>
   </w:style>
-  <w:style w:type="table" w:customStyle="1" w:styleId="TableNormal0">
-    <w:name w:val="TableNormal"/>
-    <w:tblPr>
-      <w:tblCellMar>
-        <w:top w:w="0" w:type="dxa"/>
-        <w:left w:w="0" w:type="dxa"/>
-        <w:bottom w:w="0" w:type="dxa"/>
-        <w:right w:w="0" w:type="dxa"/>
-      </w:tblCellMar>
-    </w:tblPr>
+  <w:style w:type="character" w:customStyle="1" w:styleId="Heading1Char">
+    <w:name w:val="Heading 1 Char"/>
+    <w:basedOn w:val="DefaultParagraphFont"/>
+    <w:link w:val="Heading1"/>
+    <w:uiPriority w:val="9"/>
+    <w:rsid w:val="00724C46"/>
+    <w:rPr>
+      <w:rFonts w:asciiTheme="majorHAnsi" w:eastAsiaTheme="majorEastAsia" w:hAnsiTheme="majorHAnsi" w:cstheme="majorBidi"/>
+      <w:color w:val="2F5496" w:themeColor="accent1" w:themeShade="BF"/>
+      <w:sz w:val="40"/>
+      <w:szCs w:val="40"/>
+    </w:rPr>
+  </w:style>
+  <w:style w:type="character" w:customStyle="1" w:styleId="Heading2Char">
+    <w:name w:val="Heading 2 Char"/>
+    <w:basedOn w:val="DefaultParagraphFont"/>
+    <w:link w:val="Heading2"/>
+    <w:uiPriority w:val="9"/>
+    <w:rsid w:val="00724C46"/>
+    <w:rPr>
+      <w:rFonts w:asciiTheme="majorHAnsi" w:eastAsiaTheme="majorEastAsia" w:hAnsiTheme="majorHAnsi" w:cstheme="majorBidi"/>
+      <w:color w:val="2F5496" w:themeColor="accent1" w:themeShade="BF"/>
+      <w:sz w:val="32"/>
+      <w:szCs w:val="32"/>
+    </w:rPr>
+  </w:style>
+  <w:style w:type="character" w:customStyle="1" w:styleId="Heading3Char">
+    <w:name w:val="Heading 3 Char"/>
+    <w:basedOn w:val="DefaultParagraphFont"/>
+    <w:link w:val="Heading3"/>
+    <w:uiPriority w:val="9"/>
+    <w:rsid w:val="00724C46"/>
+    <w:rPr>
+      <w:rFonts w:eastAsiaTheme="majorEastAsia" w:cstheme="majorBidi"/>
+      <w:color w:val="2F5496" w:themeColor="accent1" w:themeShade="BF"/>
+      <w:sz w:val="28"/>
+      <w:szCs w:val="28"/>
+    </w:rPr>
+  </w:style>
+  <w:style w:type="character" w:customStyle="1" w:styleId="Heading4Char">
+    <w:name w:val="Heading 4 Char"/>
+    <w:basedOn w:val="DefaultParagraphFont"/>
+    <w:link w:val="Heading4"/>
+    <w:uiPriority w:val="9"/>
+    <w:semiHidden/>
+    <w:rsid w:val="00724C46"/>
+    <w:rPr>
+      <w:rFonts w:eastAsiaTheme="majorEastAsia" w:cstheme="majorBidi"/>
+      <w:i/>
+      <w:iCs/>
+      <w:color w:val="2F5496" w:themeColor="accent1" w:themeShade="BF"/>
+    </w:rPr>
+  </w:style>
+  <w:style w:type="character" w:customStyle="1" w:styleId="Heading5Char">
+    <w:name w:val="Heading 5 Char"/>
+    <w:basedOn w:val="DefaultParagraphFont"/>
+    <w:link w:val="Heading5"/>
+    <w:uiPriority w:val="9"/>
+    <w:semiHidden/>
+    <w:rsid w:val="00724C46"/>
+    <w:rPr>
+      <w:rFonts w:eastAsiaTheme="majorEastAsia" w:cstheme="majorBidi"/>
+      <w:color w:val="2F5496" w:themeColor="accent1" w:themeShade="BF"/>
+    </w:rPr>
+  </w:style>
+  <w:style w:type="character" w:customStyle="1" w:styleId="Heading6Char">
+    <w:name w:val="Heading 6 Char"/>
+    <w:basedOn w:val="DefaultParagraphFont"/>
+    <w:link w:val="Heading6"/>
+    <w:uiPriority w:val="9"/>
+    <w:semiHidden/>
+    <w:rsid w:val="00724C46"/>
+    <w:rPr>
+      <w:rFonts w:eastAsiaTheme="majorEastAsia" w:cstheme="majorBidi"/>
+      <w:i/>
+      <w:iCs/>
+      <w:color w:val="595959" w:themeColor="text1" w:themeTint="A6"/>
+    </w:rPr>
+  </w:style>
+  <w:style w:type="character" w:customStyle="1" w:styleId="Heading7Char">
+    <w:name w:val="Heading 7 Char"/>
+    <w:basedOn w:val="DefaultParagraphFont"/>
+    <w:link w:val="Heading7"/>
+    <w:uiPriority w:val="9"/>
+    <w:semiHidden/>
+    <w:rsid w:val="00724C46"/>
+    <w:rPr>
+      <w:rFonts w:eastAsiaTheme="majorEastAsia" w:cstheme="majorBidi"/>
+      <w:color w:val="595959" w:themeColor="text1" w:themeTint="A6"/>
+    </w:rPr>
+  </w:style>
+  <w:style w:type="character" w:customStyle="1" w:styleId="Heading8Char">
+    <w:name w:val="Heading 8 Char"/>
+    <w:basedOn w:val="DefaultParagraphFont"/>
+    <w:link w:val="Heading8"/>
+    <w:uiPriority w:val="9"/>
+    <w:semiHidden/>
+    <w:rsid w:val="00724C46"/>
+    <w:rPr>
+      <w:rFonts w:eastAsiaTheme="majorEastAsia" w:cstheme="majorBidi"/>
+      <w:i/>
+      <w:iCs/>
+      <w:color w:val="272727" w:themeColor="text1" w:themeTint="D8"/>
+    </w:rPr>
+  </w:style>
+  <w:style w:type="character" w:customStyle="1" w:styleId="Heading9Char">
+    <w:name w:val="Heading 9 Char"/>
+    <w:basedOn w:val="DefaultParagraphFont"/>
+    <w:link w:val="Heading9"/>
+    <w:uiPriority w:val="9"/>
+    <w:semiHidden/>
+    <w:rsid w:val="00724C46"/>
+    <w:rPr>
+      <w:rFonts w:eastAsiaTheme="majorEastAsia" w:cstheme="majorBidi"/>
+      <w:color w:val="272727" w:themeColor="text1" w:themeTint="D8"/>
+    </w:rPr>
   </w:style>
   <w:style w:type="paragraph" w:styleId="Title">
     <w:name w:val="Title"/>
     <w:basedOn w:val="Normal"/>
     <w:next w:val="Normal"/>
+    <w:link w:val="TitleChar"/>
     <w:uiPriority w:val="10"/>
     <w:qFormat/>
+    <w:rsid w:val="00724C46"/>
     <w:pPr>
-      <w:keepNext/>
-      <w:keepLines/>
-      <w:spacing w:after="60"/>
+      <w:spacing w:after="80" w:line="240" w:lineRule="auto"/>
+      <w:contextualSpacing/>
     </w:pPr>
     <w:rPr>
-      <w:sz w:val="52"/>
-      <w:szCs w:val="52"/>
+      <w:rFonts w:asciiTheme="majorHAnsi" w:eastAsiaTheme="majorEastAsia" w:hAnsiTheme="majorHAnsi" w:cstheme="majorBidi"/>
+      <w:spacing w:val="-10"/>
+      <w:kern w:val="28"/>
+      <w:sz w:val="56"/>
+      <w:szCs w:val="56"/>
+    </w:rPr>
+  </w:style>
+  <w:style w:type="character" w:customStyle="1" w:styleId="TitleChar">
+    <w:name w:val="Title Char"/>
+    <w:basedOn w:val="DefaultParagraphFont"/>
+    <w:link w:val="Title"/>
+    <w:uiPriority w:val="10"/>
+    <w:rsid w:val="00724C46"/>
+    <w:rPr>
+      <w:rFonts w:asciiTheme="majorHAnsi" w:eastAsiaTheme="majorEastAsia" w:hAnsiTheme="majorHAnsi" w:cstheme="majorBidi"/>
+      <w:spacing w:val="-10"/>
+      <w:kern w:val="28"/>
+      <w:sz w:val="56"/>
+      <w:szCs w:val="56"/>
     </w:rPr>
   </w:style>
   <w:style w:type="paragraph" w:styleId="Subtitle">
     <w:name w:val="Subtitle"/>
     <w:basedOn w:val="Normal"/>
     <w:next w:val="Normal"/>
+    <w:link w:val="SubtitleChar"/>
     <w:uiPriority w:val="11"/>
     <w:qFormat/>
+    <w:rsid w:val="00724C46"/>
     <w:pPr>
-      <w:keepNext/>
-      <w:keepLines/>
-      <w:spacing w:after="320"/>
+      <w:numPr>
+        <w:ilvl w:val="1"/>
+      </w:numPr>
     </w:pPr>
     <w:rPr>
-      <w:color w:val="666666"/>
-      <w:sz w:val="30"/>
-      <w:szCs w:val="30"/>
+      <w:rFonts w:eastAsiaTheme="majorEastAsia" w:cstheme="majorBidi"/>
+      <w:color w:val="595959" w:themeColor="text1" w:themeTint="A6"/>
+      <w:spacing w:val="15"/>
+      <w:sz w:val="28"/>
+      <w:szCs w:val="28"/>
+    </w:rPr>
+  </w:style>
+  <w:style w:type="character" w:customStyle="1" w:styleId="SubtitleChar">
+    <w:name w:val="Subtitle Char"/>
+    <w:basedOn w:val="DefaultParagraphFont"/>
+    <w:link w:val="Subtitle"/>
+    <w:uiPriority w:val="11"/>
+    <w:rsid w:val="00724C46"/>
+    <w:rPr>
+      <w:rFonts w:eastAsiaTheme="majorEastAsia" w:cstheme="majorBidi"/>
+      <w:color w:val="595959" w:themeColor="text1" w:themeTint="A6"/>
+      <w:spacing w:val="15"/>
+      <w:sz w:val="28"/>
+      <w:szCs w:val="28"/>
+    </w:rPr>
+  </w:style>
+  <w:style w:type="paragraph" w:styleId="Quote">
+    <w:name w:val="Quote"/>
+    <w:basedOn w:val="Normal"/>
+    <w:next w:val="Normal"/>
+    <w:link w:val="QuoteChar"/>
+    <w:uiPriority w:val="29"/>
+    <w:qFormat/>
+    <w:rsid w:val="00724C46"/>
+    <w:pPr>
+      <w:spacing w:before="160"/>
+      <w:jc w:val="center"/>
+    </w:pPr>
+    <w:rPr>
+      <w:i/>
+      <w:iCs/>
+      <w:color w:val="404040" w:themeColor="text1" w:themeTint="BF"/>
+    </w:rPr>
+  </w:style>
+  <w:style w:type="character" w:customStyle="1" w:styleId="QuoteChar">
+    <w:name w:val="Quote Char"/>
+    <w:basedOn w:val="DefaultParagraphFont"/>
+    <w:link w:val="Quote"/>
+    <w:uiPriority w:val="29"/>
+    <w:rsid w:val="00724C46"/>
+    <w:rPr>
+      <w:i/>
+      <w:iCs/>
+      <w:color w:val="404040" w:themeColor="text1" w:themeTint="BF"/>
+    </w:rPr>
+  </w:style>
+  <w:style w:type="paragraph" w:styleId="ListParagraph">
+    <w:name w:val="List Paragraph"/>
+    <w:basedOn w:val="Normal"/>
+    <w:uiPriority w:val="34"/>
+    <w:qFormat/>
+    <w:rsid w:val="00724C46"/>
+    <w:pPr>
+      <w:ind w:left="720"/>
+      <w:contextualSpacing/>
+    </w:pPr>
+  </w:style>
+  <w:style w:type="character" w:styleId="IntenseEmphasis">
+    <w:name w:val="Intense Emphasis"/>
+    <w:basedOn w:val="DefaultParagraphFont"/>
+    <w:uiPriority w:val="21"/>
+    <w:qFormat/>
+    <w:rsid w:val="00724C46"/>
+    <w:rPr>
+      <w:i/>
+      <w:iCs/>
+      <w:color w:val="2F5496" w:themeColor="accent1" w:themeShade="BF"/>
+    </w:rPr>
+  </w:style>
+  <w:style w:type="paragraph" w:styleId="IntenseQuote">
+    <w:name w:val="Intense Quote"/>
+    <w:basedOn w:val="Normal"/>
+    <w:next w:val="Normal"/>
+    <w:link w:val="IntenseQuoteChar"/>
+    <w:uiPriority w:val="30"/>
+    <w:qFormat/>
+    <w:rsid w:val="00724C46"/>
+    <w:pPr>
+      <w:pBdr>
+        <w:top w:val="single" w:sz="4" w:space="10" w:color="2F5496" w:themeColor="accent1" w:themeShade="BF"/>
+        <w:bottom w:val="single" w:sz="4" w:space="10" w:color="2F5496" w:themeColor="accent1" w:themeShade="BF"/>
+      </w:pBdr>
+      <w:spacing w:before="360" w:after="360"/>
+      <w:ind w:left="864" w:right="864"/>
+      <w:jc w:val="center"/>
+    </w:pPr>
+    <w:rPr>
+      <w:i/>
+      <w:iCs/>
+      <w:color w:val="2F5496" w:themeColor="accent1" w:themeShade="BF"/>
+    </w:rPr>
+  </w:style>
+  <w:style w:type="character" w:customStyle="1" w:styleId="IntenseQuoteChar">
+    <w:name w:val="Intense Quote Char"/>
+    <w:basedOn w:val="DefaultParagraphFont"/>
+    <w:link w:val="IntenseQuote"/>
+    <w:uiPriority w:val="30"/>
+    <w:rsid w:val="00724C46"/>
+    <w:rPr>
+      <w:i/>
+      <w:iCs/>
+      <w:color w:val="2F5496" w:themeColor="accent1" w:themeShade="BF"/>
+    </w:rPr>
+  </w:style>
+  <w:style w:type="character" w:styleId="IntenseReference">
+    <w:name w:val="Intense Reference"/>
+    <w:basedOn w:val="DefaultParagraphFont"/>
+    <w:uiPriority w:val="32"/>
+    <w:qFormat/>
+    <w:rsid w:val="00724C46"/>
+    <w:rPr>
+      <w:b/>
+      <w:bCs/>
+      <w:smallCaps/>
+      <w:color w:val="2F5496" w:themeColor="accent1" w:themeShade="BF"/>
+      <w:spacing w:val="5"/>
     </w:rPr>
   </w:style>
 </w:styles>
@@ -6841,44 +7393,44 @@
         <a:sysClr val="window" lastClr="FFFFFF"/>
       </a:lt1>
       <a:dk2>
-        <a:srgbClr val="1F497D"/>
+        <a:srgbClr val="44546A"/>
       </a:dk2>
       <a:lt2>
-        <a:srgbClr val="EEECE1"/>
+        <a:srgbClr val="E7E6E6"/>
       </a:lt2>
       <a:accent1>
-        <a:srgbClr val="4F81BD"/>
+        <a:srgbClr val="4472C4"/>
       </a:accent1>
       <a:accent2>
-        <a:srgbClr val="C0504D"/>
+        <a:srgbClr val="ED7D31"/>
       </a:accent2>
       <a:accent3>
-        <a:srgbClr val="9BBB59"/>
+        <a:srgbClr val="A5A5A5"/>
       </a:accent3>
       <a:accent4>
-        <a:srgbClr val="8064A2"/>
+        <a:srgbClr val="FFC000"/>
       </a:accent4>
       <a:accent5>
-        <a:srgbClr val="4BACC6"/>
+        <a:srgbClr val="5B9BD5"/>
       </a:accent5>
       <a:accent6>
-        <a:srgbClr val="F79646"/>
+        <a:srgbClr val="70AD47"/>
       </a:accent6>
       <a:hlink>
-        <a:srgbClr val="0000FF"/>
+        <a:srgbClr val="0563C1"/>
       </a:hlink>
       <a:folHlink>
-        <a:srgbClr val="800080"/>
+        <a:srgbClr val="954F72"/>
       </a:folHlink>
     </a:clrScheme>
     <a:fontScheme name="Office">
       <a:majorFont>
-        <a:latin typeface="Calibri"/>
+        <a:latin typeface="Calibri Light" panose="020F0302020204030204"/>
         <a:ea typeface=""/>
         <a:cs typeface=""/>
-        <a:font script="Jpan" typeface="ＭＳ ゴシック"/>
+        <a:font script="Jpan" typeface="游ゴシック Light"/>
         <a:font script="Hang" typeface="맑은 고딕"/>
-        <a:font script="Hans" typeface="宋体"/>
+        <a:font script="Hans" typeface="等线 Light"/>
         <a:font script="Hant" typeface="新細明體"/>
         <a:font script="Arab" typeface="Times New Roman"/>
         <a:font script="Hebr" typeface="Times New Roman"/>
@@ -6906,14 +7458,31 @@
         <a:font script="Viet" typeface="Times New Roman"/>
         <a:font script="Uigh" typeface="Microsoft Uighur"/>
         <a:font script="Geor" typeface="Sylfaen"/>
+        <a:font script="Armn" typeface="Arial"/>
+        <a:font script="Bugi" typeface="Leelawadee UI"/>
+        <a:font script="Bopo" typeface="Microsoft JhengHei"/>
+        <a:font script="Java" typeface="Javanese Text"/>
+        <a:font script="Lisu" typeface="Segoe UI"/>
+        <a:font script="Mymr" typeface="Myanmar Text"/>
+        <a:font script="Nkoo" typeface="Ebrima"/>
+        <a:font script="Olck" typeface="Nirmala UI"/>
+        <a:font script="Osma" typeface="Ebrima"/>
+        <a:font script="Phag" typeface="Phagspa"/>
+        <a:font script="Syrn" typeface="Estrangelo Edessa"/>
+        <a:font script="Syrj" typeface="Estrangelo Edessa"/>
+        <a:font script="Syre" typeface="Estrangelo Edessa"/>
+        <a:font script="Sora" typeface="Nirmala UI"/>
+        <a:font script="Tale" typeface="Microsoft Tai Le"/>
+        <a:font script="Talu" typeface="Microsoft New Tai Lue"/>
+        <a:font script="Tfng" typeface="Ebrima"/>
       </a:majorFont>
       <a:minorFont>
-        <a:latin typeface="Cambria"/>
+        <a:latin typeface="Calibri" panose="020F0502020204030204"/>
         <a:ea typeface=""/>
         <a:cs typeface=""/>
-        <a:font script="Jpan" typeface="ＭＳ 明朝"/>
+        <a:font script="Jpan" typeface="游ゴシック"/>
         <a:font script="Hang" typeface="맑은 고딕"/>
-        <a:font script="Hans" typeface="宋体"/>
+        <a:font script="Hans" typeface="等线"/>
         <a:font script="Hant" typeface="新細明體"/>
         <a:font script="Arab" typeface="Arial"/>
         <a:font script="Hebr" typeface="Arial"/>
@@ -6941,6 +7510,23 @@
         <a:font script="Viet" typeface="Arial"/>
         <a:font script="Uigh" typeface="Microsoft Uighur"/>
         <a:font script="Geor" typeface="Sylfaen"/>
+        <a:font script="Armn" typeface="Arial"/>
+        <a:font script="Bugi" typeface="Leelawadee UI"/>
+        <a:font script="Bopo" typeface="Microsoft JhengHei"/>
+        <a:font script="Java" typeface="Javanese Text"/>
+        <a:font script="Lisu" typeface="Segoe UI"/>
+        <a:font script="Mymr" typeface="Myanmar Text"/>
+        <a:font script="Nkoo" typeface="Ebrima"/>
+        <a:font script="Olck" typeface="Nirmala UI"/>
+        <a:font script="Osma" typeface="Ebrima"/>
+        <a:font script="Phag" typeface="Phagspa"/>
+        <a:font script="Syrn" typeface="Estrangelo Edessa"/>
+        <a:font script="Syrj" typeface="Estrangelo Edessa"/>
+        <a:font script="Syre" typeface="Estrangelo Edessa"/>
+        <a:font script="Sora" typeface="Nirmala UI"/>
+        <a:font script="Tale" typeface="Microsoft Tai Le"/>
+        <a:font script="Talu" typeface="Microsoft New Tai Lue"/>
+        <a:font script="Tfng" typeface="Ebrima"/>
       </a:minorFont>
     </a:fontScheme>
     <a:fmtScheme name="Office">
@@ -6952,200 +7538,141 @@
           <a:gsLst>
             <a:gs pos="0">
               <a:schemeClr val="phClr">
-                <a:tint val="50000"/>
-                <a:satMod val="300000"/>
+                <a:lumMod val="110000"/>
+                <a:satMod val="105000"/>
+                <a:tint val="67000"/>
               </a:schemeClr>
             </a:gs>
-            <a:gs pos="35000">
+            <a:gs pos="50000">
               <a:schemeClr val="phClr">
-                <a:tint val="37000"/>
-                <a:satMod val="300000"/>
+                <a:lumMod val="105000"/>
+                <a:satMod val="103000"/>
+                <a:tint val="73000"/>
               </a:schemeClr>
             </a:gs>
             <a:gs pos="100000">
               <a:schemeClr val="phClr">
-                <a:tint val="15000"/>
-                <a:satMod val="350000"/>
+                <a:lumMod val="105000"/>
+                <a:satMod val="109000"/>
+                <a:tint val="81000"/>
               </a:schemeClr>
             </a:gs>
           </a:gsLst>
-          <a:lin ang="16200000" scaled="1"/>
+          <a:lin ang="5400000" scaled="0"/>
         </a:gradFill>
         <a:gradFill rotWithShape="1">
           <a:gsLst>
             <a:gs pos="0">
               <a:schemeClr val="phClr">
-                <a:tint val="100000"/>
+                <a:satMod val="103000"/>
+                <a:lumMod val="102000"/>
+                <a:tint val="94000"/>
+              </a:schemeClr>
+            </a:gs>
+            <a:gs pos="50000">
+              <a:schemeClr val="phClr">
+                <a:satMod val="110000"/>
+                <a:lumMod val="100000"/>
                 <a:shade val="100000"/>
-                <a:satMod val="130000"/>
               </a:schemeClr>
             </a:gs>
             <a:gs pos="100000">
               <a:schemeClr val="phClr">
-                <a:tint val="50000"/>
-                <a:shade val="100000"/>
-                <a:satMod val="350000"/>
+                <a:lumMod val="99000"/>
+                <a:satMod val="120000"/>
+                <a:shade val="78000"/>
               </a:schemeClr>
             </a:gs>
           </a:gsLst>
-          <a:lin ang="16200000" scaled="0"/>
+          <a:lin ang="5400000" scaled="0"/>
         </a:gradFill>
       </a:fillStyleLst>
       <a:lnStyleLst>
-        <a:ln w="9525" cap="flat" cmpd="sng" algn="ctr">
-          <a:solidFill>
-            <a:schemeClr val="phClr">
-              <a:shade val="95000"/>
-              <a:satMod val="105000"/>
-            </a:schemeClr>
-          </a:solidFill>
-          <a:prstDash val="solid"/>
-        </a:ln>
-        <a:ln w="25400" cap="flat" cmpd="sng" algn="ctr">
+        <a:ln w="6350" cap="flat" cmpd="sng" algn="ctr">
           <a:solidFill>
             <a:schemeClr val="phClr"/>
           </a:solidFill>
           <a:prstDash val="solid"/>
+          <a:miter lim="800000"/>
         </a:ln>
-        <a:ln w="38100" cap="flat" cmpd="sng" algn="ctr">
+        <a:ln w="12700" cap="flat" cmpd="sng" algn="ctr">
           <a:solidFill>
             <a:schemeClr val="phClr"/>
           </a:solidFill>
           <a:prstDash val="solid"/>
+          <a:miter lim="800000"/>
+        </a:ln>
+        <a:ln w="19050" cap="flat" cmpd="sng" algn="ctr">
+          <a:solidFill>
+            <a:schemeClr val="phClr"/>
+          </a:solidFill>
+          <a:prstDash val="solid"/>
+          <a:miter lim="800000"/>
         </a:ln>
       </a:lnStyleLst>
       <a:effectStyleLst>
         <a:effectStyle>
+          <a:effectLst/>
+        </a:effectStyle>
+        <a:effectStyle>
+          <a:effectLst/>
+        </a:effectStyle>
+        <a:effectStyle>
           <a:effectLst>
-            <a:outerShdw blurRad="40000" dist="20000" dir="5400000" rotWithShape="0">
+            <a:outerShdw blurRad="57150" dist="19050" dir="5400000" algn="ctr" rotWithShape="0">
               <a:srgbClr val="000000">
-                <a:alpha val="38000"/>
+                <a:alpha val="63000"/>
               </a:srgbClr>
             </a:outerShdw>
           </a:effectLst>
-        </a:effectStyle>
-        <a:effectStyle>
-          <a:effectLst>
-            <a:outerShdw blurRad="40000" dist="23000" dir="5400000" rotWithShape="0">
-              <a:srgbClr val="000000">
-                <a:alpha val="35000"/>
-              </a:srgbClr>
-            </a:outerShdw>
-          </a:effectLst>
-        </a:effectStyle>
-        <a:effectStyle>
-          <a:effectLst>
-            <a:outerShdw blurRad="40000" dist="23000" dir="5400000" rotWithShape="0">
-              <a:srgbClr val="000000">
-                <a:alpha val="35000"/>
-              </a:srgbClr>
-            </a:outerShdw>
-          </a:effectLst>
-          <a:scene3d>
-            <a:camera prst="orthographicFront">
-              <a:rot lat="0" lon="0" rev="0"/>
-            </a:camera>
-            <a:lightRig rig="threePt" dir="t">
-              <a:rot lat="0" lon="0" rev="1200000"/>
-            </a:lightRig>
-          </a:scene3d>
-          <a:sp3d>
-            <a:bevelT w="63500" h="25400"/>
-          </a:sp3d>
         </a:effectStyle>
       </a:effectStyleLst>
       <a:bgFillStyleLst>
         <a:solidFill>
           <a:schemeClr val="phClr"/>
         </a:solidFill>
+        <a:solidFill>
+          <a:schemeClr val="phClr">
+            <a:tint val="95000"/>
+            <a:satMod val="170000"/>
+          </a:schemeClr>
+        </a:solidFill>
         <a:gradFill rotWithShape="1">
           <a:gsLst>
             <a:gs pos="0">
               <a:schemeClr val="phClr">
-                <a:tint val="40000"/>
-                <a:satMod val="350000"/>
+                <a:tint val="93000"/>
+                <a:satMod val="150000"/>
+                <a:shade val="98000"/>
+                <a:lumMod val="102000"/>
               </a:schemeClr>
             </a:gs>
-            <a:gs pos="40000">
+            <a:gs pos="50000">
               <a:schemeClr val="phClr">
-                <a:tint val="45000"/>
-                <a:shade val="99000"/>
-                <a:satMod val="350000"/>
+                <a:tint val="98000"/>
+                <a:satMod val="130000"/>
+                <a:shade val="90000"/>
+                <a:lumMod val="103000"/>
               </a:schemeClr>
             </a:gs>
             <a:gs pos="100000">
               <a:schemeClr val="phClr">
-                <a:shade val="20000"/>
-                <a:satMod val="255000"/>
+                <a:shade val="63000"/>
+                <a:satMod val="120000"/>
               </a:schemeClr>
             </a:gs>
           </a:gsLst>
-          <a:path path="circle">
-            <a:fillToRect l="50000" t="-80000" r="50000" b="180000"/>
-          </a:path>
-        </a:gradFill>
-        <a:gradFill rotWithShape="1">
-          <a:gsLst>
-            <a:gs pos="0">
-              <a:schemeClr val="phClr">
-                <a:tint val="80000"/>
-                <a:satMod val="300000"/>
-              </a:schemeClr>
-            </a:gs>
-            <a:gs pos="100000">
-              <a:schemeClr val="phClr">
-                <a:shade val="30000"/>
-                <a:satMod val="200000"/>
-              </a:schemeClr>
-            </a:gs>
-          </a:gsLst>
-          <a:path path="circle">
-            <a:fillToRect l="50000" t="50000" r="50000" b="50000"/>
-          </a:path>
+          <a:lin ang="5400000" scaled="0"/>
         </a:gradFill>
       </a:bgFillStyleLst>
     </a:fmtScheme>
   </a:themeElements>
-  <a:objectDefaults>
-    <a:spDef>
-      <a:spPr/>
-      <a:bodyPr/>
-      <a:lstStyle/>
-      <a:style>
-        <a:lnRef idx="1">
-          <a:schemeClr val="accent1"/>
-        </a:lnRef>
-        <a:fillRef idx="3">
-          <a:schemeClr val="accent1"/>
-        </a:fillRef>
-        <a:effectRef idx="2">
-          <a:schemeClr val="accent1"/>
-        </a:effectRef>
-        <a:fontRef idx="minor">
-          <a:schemeClr val="lt1"/>
-        </a:fontRef>
-      </a:style>
-    </a:spDef>
-    <a:lnDef>
-      <a:spPr/>
-      <a:bodyPr/>
-      <a:lstStyle/>
-      <a:style>
-        <a:lnRef idx="2">
-          <a:schemeClr val="accent1"/>
-        </a:lnRef>
-        <a:fillRef idx="0">
-          <a:schemeClr val="accent1"/>
-        </a:fillRef>
-        <a:effectRef idx="1">
-          <a:schemeClr val="accent1"/>
-        </a:effectRef>
-        <a:fontRef idx="minor">
-          <a:schemeClr val="tx1"/>
-        </a:fontRef>
-      </a:style>
-    </a:lnDef>
-  </a:objectDefaults>
+  <a:objectDefaults/>
   <a:extraClrSchemeLst/>
+  <a:extLst>
+    <a:ext uri="{05A4C25C-085E-4340-85A3-A5531E510DB2}">
+      <thm15:themeFamily xmlns:thm15="http://schemas.microsoft.com/office/thememl/2012/main" name="Office Theme" id="{62F939B6-93AF-4DB8-9C6B-D6C7DFDC589F}" vid="{4A3C46E8-61CC-4603-A589-7422A47A8E4A}"/>
+    </a:ext>
+  </a:extLst>
 </a:theme>
 </file>
</xml_diff>